<commit_message>
Trim report to ~5-6 pages: fewer figures, shorter sections
</commit_message>
<xml_diff>
--- a/BT2024078_Report.docx
+++ b/BT2024078_Report.docx
@@ -2,101 +2,45 @@
 <file path=word/document.xml><?xml version="1.0" encoding="utf-8"?>
 <w:document xmlns:wpc="http://schemas.microsoft.com/office/word/2010/wordprocessingCanvas" xmlns:mo="http://schemas.microsoft.com/office/mac/office/2008/main" xmlns:mc="http://schemas.openxmlformats.org/markup-compatibility/2006" xmlns:mv="urn:schemas-microsoft-com:mac:vml" xmlns:o="urn:schemas-microsoft-com:office:office" xmlns:r="http://schemas.openxmlformats.org/officeDocument/2006/relationships" xmlns:m="http://schemas.openxmlformats.org/officeDocument/2006/math" xmlns:v="urn:schemas-microsoft-com:vml" xmlns:wp14="http://schemas.microsoft.com/office/word/2010/wordprocessingDrawing" xmlns:wp="http://schemas.openxmlformats.org/drawingml/2006/wordprocessingDrawing" xmlns:w10="urn:schemas-microsoft-com:office:word" xmlns:w="http://schemas.openxmlformats.org/wordprocessingml/2006/main" xmlns:w14="http://schemas.microsoft.com/office/word/2010/wordml" xmlns:wpg="http://schemas.microsoft.com/office/word/2010/wordprocessingGroup" xmlns:wpi="http://schemas.microsoft.com/office/word/2010/wordprocessingInk" xmlns:wne="http://schemas.microsoft.com/office/word/2006/wordml" xmlns:wps="http://schemas.microsoft.com/office/word/2010/wordprocessingShape" mc:Ignorable="w14 wp14">
   <w:body>
-    <w:p/>
-    <w:p/>
     <w:p>
       <w:pPr>
+        <w:spacing w:before="0" w:after="80"/>
         <w:jc w:val="center"/>
       </w:pPr>
       <w:r>
         <w:rPr>
           <w:rFonts w:ascii="Times New Roman" w:hAnsi="Times New Roman"/>
           <w:b/>
-          <w:sz w:val="36"/>
+          <w:sz w:val="32"/>
         </w:rPr>
         <w:t>Polynomial Regression Assignment</w:t>
       </w:r>
     </w:p>
-    <w:p/>
     <w:p>
       <w:pPr>
+        <w:spacing w:after="120"/>
         <w:jc w:val="center"/>
       </w:pPr>
       <w:r>
         <w:rPr>
           <w:rFonts w:ascii="Times New Roman" w:hAnsi="Times New Roman"/>
-          <w:sz w:val="26"/>
+          <w:sz w:val="22"/>
         </w:rPr>
-        <w:t>Machine Learning (CS F464)</w:t>
-      </w:r>
-    </w:p>
-    <w:p/>
-    <w:p/>
-    <w:p>
-      <w:pPr>
-        <w:spacing w:after="80"/>
-        <w:jc w:val="center"/>
-      </w:pPr>
-      <w:r>
-        <w:rPr>
-          <w:b/>
-          <w:sz w:val="24"/>
-        </w:rPr>
-        <w:t xml:space="preserve">Name:  </w:t>
-      </w:r>
-      <w:r>
-        <w:rPr>
-          <w:sz w:val="24"/>
-        </w:rPr>
-        <w:t>Aangir Doshi</w:t>
+        <w:t>Machine Learning  |  Aangir Doshi  |  BT2024078</w:t>
       </w:r>
     </w:p>
     <w:p>
       <w:pPr>
-        <w:spacing w:after="80"/>
-        <w:jc w:val="center"/>
+        <w:spacing w:after="120"/>
+        <w:pBdr>
+          <w:bottom w:val="single" w:sz="6" w:space="1" w:color="888888"/>
+        </w:pBdr>
       </w:pPr>
-      <w:r>
-        <w:rPr>
-          <w:b/>
-          <w:sz w:val="24"/>
-        </w:rPr>
-        <w:t xml:space="preserve">Roll Number:  </w:t>
-      </w:r>
-      <w:r>
-        <w:rPr>
-          <w:sz w:val="24"/>
-        </w:rPr>
-        <w:t>BT2024078</w:t>
-      </w:r>
-    </w:p>
-    <w:p>
-      <w:pPr>
-        <w:spacing w:after="80"/>
-        <w:jc w:val="center"/>
-      </w:pPr>
-      <w:r>
-        <w:rPr>
-          <w:b/>
-          <w:sz w:val="24"/>
-        </w:rPr>
-        <w:t xml:space="preserve">Assignment:  </w:t>
-      </w:r>
-      <w:r>
-        <w:rPr>
-          <w:sz w:val="24"/>
-        </w:rPr>
-        <w:t>Polynomial Regression – Phase 1 &amp; Phase 2</w:t>
-      </w:r>
-    </w:p>
-    <w:p>
-      <w:r>
-        <w:br w:type="page"/>
-      </w:r>
     </w:p>
     <w:p>
       <w:pPr>
         <w:pStyle w:val="Heading1"/>
+        <w:spacing w:before="80" w:after="60"/>
         <w:jc w:val="left"/>
       </w:pPr>
       <w:r>
@@ -105,7 +49,7 @@
     </w:p>
     <w:p>
       <w:pPr>
-        <w:spacing w:before="40" w:after="120"/>
+        <w:spacing w:before="40" w:after="80"/>
         <w:jc w:val="left"/>
       </w:pPr>
       <w:r>
@@ -114,12 +58,12 @@
           <w:i w:val="0"/>
           <w:sz w:val="22"/>
         </w:rPr>
-        <w:t>This report covers my work on the two polynomial regression problems assigned for this course. For each problem I had to build a model that predicts a continuous output y from the given input features, using only the training data provided. The goal was to pick the right polynomial degree and keep overfitting under control so the model generalises well to the test set.</w:t>
+        <w:t>This report describes the polynomial regression models I built for the two assigned problems. Var1 asks for predictions of the Net Power Score of a geothermal steam turbine using six operational parameters (x1–x6). Var2 asks for predictions of a Thermal Anomaly Score at 3D spatial coordinates (x1, x2, x3) to guide drilling decisions. Both datasets were unique to my roll number.</w:t>
       </w:r>
     </w:p>
     <w:p>
       <w:pPr>
-        <w:spacing w:before="40" w:after="120"/>
+        <w:spacing w:before="40" w:after="80"/>
         <w:jc w:val="left"/>
       </w:pPr>
       <w:r>
@@ -128,61 +72,14 @@
           <w:i w:val="0"/>
           <w:sz w:val="22"/>
         </w:rPr>
-        <w:t>The two problems are set in the context of a geothermal power plant project. The first one (var1) asks you to predict the Net Power Score of a steam turbine based on six operational parameters. The second one (var2) involves predicting a Thermal Anomaly Score at different 3D coordinates, which is used to find the best spots for drilling. Both datasets were individually generated per roll number, so the polynomial structure is unique to my data.</w:t>
+        <w:t>Both datasets were already clean — no missing values, and all features were pre-normalised to [-1, 1] — so no preprocessing was needed beyond building polynomial features. The table below gives a quick overview of what the data looks like.</w:t>
       </w:r>
     </w:p>
     <w:p>
       <w:pPr>
-        <w:pStyle w:val="Heading1"/>
-        <w:jc w:val="left"/>
+        <w:spacing w:after="40"/>
       </w:pPr>
-      <w:r>
-        <w:t>2. Looking at the Data</w:t>
-      </w:r>
     </w:p>
-    <w:p>
-      <w:pPr>
-        <w:spacing w:before="40" w:after="120"/>
-        <w:jc w:val="left"/>
-      </w:pPr>
-      <w:r>
-        <w:rPr>
-          <w:b w:val="0"/>
-          <w:i w:val="0"/>
-          <w:sz w:val="22"/>
-        </w:rPr>
-        <w:t>Before doing anything else I spent some time just looking at both datasets to understand what I was working with. A few things stood out immediately:</w:t>
-      </w:r>
-    </w:p>
-    <w:p>
-      <w:pPr>
-        <w:spacing w:before="40" w:after="120"/>
-        <w:jc w:val="left"/>
-      </w:pPr>
-      <w:r>
-        <w:rPr>
-          <w:b w:val="0"/>
-          <w:i w:val="0"/>
-          <w:sz w:val="22"/>
-        </w:rPr>
-        <w:t>Both datasets were already clean — no missing values at all, and the input features were already normalised to lie in the range [-1, 1]. That was convenient because it meant I didn't have to worry about scaling before building polynomial features. Polynomial regression can go badly wrong if features are on very different scales, so having them pre-normalised saved a step.</w:t>
-      </w:r>
-    </w:p>
-    <w:p>
-      <w:pPr>
-        <w:spacing w:before="40" w:after="120"/>
-        <w:jc w:val="left"/>
-      </w:pPr>
-      <w:r>
-        <w:rPr>
-          <w:b w:val="0"/>
-          <w:i w:val="0"/>
-          <w:sz w:val="22"/>
-        </w:rPr>
-        <w:t>The target variable y in var1 ranges from about -9.8 to +12 with a standard deviation of 3.2 and almost no skew (0.04), so the distribution is fairly symmetric. Var2 has a much wider range (-29.8 to +39.3, std = 7.3) and a mild positive skew of 0.65 — nothing dramatic enough to warrant any transformations, but worth noting.</w:t>
-      </w:r>
-    </w:p>
-    <w:p/>
     <w:tbl>
       <w:tblPr>
         <w:tblStyle w:val="TableGrid"/>
@@ -207,7 +104,7 @@
             <w:r>
               <w:rPr>
                 <w:b/>
-                <w:sz w:val="20"/>
+                <w:sz w:val="19"/>
               </w:rPr>
             </w:r>
           </w:p>
@@ -223,7 +120,7 @@
             <w:r>
               <w:rPr>
                 <w:b/>
-                <w:sz w:val="20"/>
+                <w:sz w:val="19"/>
               </w:rPr>
               <w:t>Var1 (Steam Turbine)</w:t>
             </w:r>
@@ -240,7 +137,7 @@
             <w:r>
               <w:rPr>
                 <w:b/>
-                <w:sz w:val="20"/>
+                <w:sz w:val="19"/>
               </w:rPr>
               <w:t>Var2 (Thermal Reservoir)</w:t>
             </w:r>
@@ -258,7 +155,7 @@
             </w:pPr>
             <w:r>
               <w:rPr>
-                <w:sz w:val="20"/>
+                <w:sz w:val="19"/>
               </w:rPr>
               <w:t>Features</w:t>
             </w:r>
@@ -274,9 +171,9 @@
             </w:pPr>
             <w:r>
               <w:rPr>
-                <w:sz w:val="20"/>
+                <w:sz w:val="19"/>
               </w:rPr>
-              <w:t>6  (x1 to x6)</w:t>
+              <w:t>6  (x1–x6)</w:t>
             </w:r>
           </w:p>
         </w:tc>
@@ -290,7 +187,7 @@
             </w:pPr>
             <w:r>
               <w:rPr>
-                <w:sz w:val="20"/>
+                <w:sz w:val="19"/>
               </w:rPr>
               <w:t>3  (x1, x2, x3)</w:t>
             </w:r>
@@ -308,9 +205,9 @@
             </w:pPr>
             <w:r>
               <w:rPr>
-                <w:sz w:val="20"/>
+                <w:sz w:val="19"/>
               </w:rPr>
-              <w:t>Training rows</w:t>
+              <w:t>Train / Test</w:t>
             </w:r>
           </w:p>
         </w:tc>
@@ -324,9 +221,9 @@
             </w:pPr>
             <w:r>
               <w:rPr>
-                <w:sz w:val="20"/>
+                <w:sz w:val="19"/>
               </w:rPr>
-              <w:t>1000</w:t>
+              <w:t>1000 / 1000</w:t>
             </w:r>
           </w:p>
         </w:tc>
@@ -340,9 +237,9 @@
             </w:pPr>
             <w:r>
               <w:rPr>
-                <w:sz w:val="20"/>
+                <w:sz w:val="19"/>
               </w:rPr>
-              <w:t>1000</w:t>
+              <w:t>1000 / 1000</w:t>
             </w:r>
           </w:p>
         </w:tc>
@@ -358,107 +255,7 @@
             </w:pPr>
             <w:r>
               <w:rPr>
-                <w:sz w:val="20"/>
-              </w:rPr>
-              <w:t>Test rows</w:t>
-            </w:r>
-          </w:p>
-        </w:tc>
-        <w:tc>
-          <w:tcPr>
-            <w:tcW w:type="dxa" w:w="3022"/>
-          </w:tcPr>
-          <w:p>
-            <w:pPr>
-              <w:jc w:val="center"/>
-            </w:pPr>
-            <w:r>
-              <w:rPr>
-                <w:sz w:val="20"/>
-              </w:rPr>
-              <w:t>1000</w:t>
-            </w:r>
-          </w:p>
-        </w:tc>
-        <w:tc>
-          <w:tcPr>
-            <w:tcW w:type="dxa" w:w="3022"/>
-          </w:tcPr>
-          <w:p>
-            <w:pPr>
-              <w:jc w:val="center"/>
-            </w:pPr>
-            <w:r>
-              <w:rPr>
-                <w:sz w:val="20"/>
-              </w:rPr>
-              <w:t>1000</w:t>
-            </w:r>
-          </w:p>
-        </w:tc>
-      </w:tr>
-      <w:tr>
-        <w:tc>
-          <w:tcPr>
-            <w:tcW w:type="dxa" w:w="3022"/>
-          </w:tcPr>
-          <w:p>
-            <w:pPr>
-              <w:jc w:val="center"/>
-            </w:pPr>
-            <w:r>
-              <w:rPr>
-                <w:sz w:val="20"/>
-              </w:rPr>
-              <w:t>Feature range</w:t>
-            </w:r>
-          </w:p>
-        </w:tc>
-        <w:tc>
-          <w:tcPr>
-            <w:tcW w:type="dxa" w:w="3022"/>
-          </w:tcPr>
-          <w:p>
-            <w:pPr>
-              <w:jc w:val="center"/>
-            </w:pPr>
-            <w:r>
-              <w:rPr>
-                <w:sz w:val="20"/>
-              </w:rPr>
-              <w:t>[-1, 1]</w:t>
-            </w:r>
-          </w:p>
-        </w:tc>
-        <w:tc>
-          <w:tcPr>
-            <w:tcW w:type="dxa" w:w="3022"/>
-          </w:tcPr>
-          <w:p>
-            <w:pPr>
-              <w:jc w:val="center"/>
-            </w:pPr>
-            <w:r>
-              <w:rPr>
-                <w:sz w:val="20"/>
-              </w:rPr>
-              <w:t>[-1, 1]</w:t>
-            </w:r>
-          </w:p>
-        </w:tc>
-      </w:tr>
-      <w:tr>
-        <w:tc>
-          <w:tcPr>
-            <w:tcW w:type="dxa" w:w="3022"/>
-          </w:tcPr>
-          <w:p>
-            <w:pPr>
-              <w:jc w:val="center"/>
-            </w:pPr>
-            <w:r>
-              <w:rPr>
-                <w:sz w:val="20"/>
+                <w:sz w:val="19"/>
               </w:rPr>
               <w:t>y range</w:t>
             </w:r>
@@ -474,7 +271,7 @@
             </w:pPr>
             <w:r>
               <w:rPr>
-                <w:sz w:val="20"/>
+                <w:sz w:val="19"/>
               </w:rPr>
               <w:t>-9.80 to +11.99</w:t>
             </w:r>
@@ -490,7 +287,7 @@
             </w:pPr>
             <w:r>
               <w:rPr>
-                <w:sz w:val="20"/>
+                <w:sz w:val="19"/>
               </w:rPr>
               <w:t>-29.82 to +39.30</w:t>
             </w:r>
@@ -508,9 +305,9 @@
             </w:pPr>
             <w:r>
               <w:rPr>
-                <w:sz w:val="20"/>
+                <w:sz w:val="19"/>
               </w:rPr>
-              <w:t>y mean</w:t>
+              <w:t>y std / skew</w:t>
             </w:r>
           </w:p>
         </w:tc>
@@ -524,9 +321,9 @@
             </w:pPr>
             <w:r>
               <w:rPr>
-                <w:sz w:val="20"/>
+                <w:sz w:val="19"/>
               </w:rPr>
-              <w:t>0.76</w:t>
+              <w:t>3.21 / 0.04</w:t>
             </w:r>
           </w:p>
         </w:tc>
@@ -540,243 +337,32 @@
             </w:pPr>
             <w:r>
               <w:rPr>
-                <w:sz w:val="20"/>
+                <w:sz w:val="19"/>
               </w:rPr>
-              <w:t>1.81</w:t>
-            </w:r>
-          </w:p>
-        </w:tc>
-      </w:tr>
-      <w:tr>
-        <w:tc>
-          <w:tcPr>
-            <w:tcW w:type="dxa" w:w="3022"/>
-          </w:tcPr>
-          <w:p>
-            <w:pPr>
-              <w:jc w:val="center"/>
-            </w:pPr>
-            <w:r>
-              <w:rPr>
-                <w:sz w:val="20"/>
-              </w:rPr>
-              <w:t>y std</w:t>
-            </w:r>
-          </w:p>
-        </w:tc>
-        <w:tc>
-          <w:tcPr>
-            <w:tcW w:type="dxa" w:w="3022"/>
-          </w:tcPr>
-          <w:p>
-            <w:pPr>
-              <w:jc w:val="center"/>
-            </w:pPr>
-            <w:r>
-              <w:rPr>
-                <w:sz w:val="20"/>
-              </w:rPr>
-              <w:t>3.21</w:t>
-            </w:r>
-          </w:p>
-        </w:tc>
-        <w:tc>
-          <w:tcPr>
-            <w:tcW w:type="dxa" w:w="3022"/>
-          </w:tcPr>
-          <w:p>
-            <w:pPr>
-              <w:jc w:val="center"/>
-            </w:pPr>
-            <w:r>
-              <w:rPr>
-                <w:sz w:val="20"/>
-              </w:rPr>
-              <w:t>7.27</w:t>
-            </w:r>
-          </w:p>
-        </w:tc>
-      </w:tr>
-      <w:tr>
-        <w:tc>
-          <w:tcPr>
-            <w:tcW w:type="dxa" w:w="3022"/>
-          </w:tcPr>
-          <w:p>
-            <w:pPr>
-              <w:jc w:val="center"/>
-            </w:pPr>
-            <w:r>
-              <w:rPr>
-                <w:sz w:val="20"/>
-              </w:rPr>
-              <w:t>y skew</w:t>
-            </w:r>
-          </w:p>
-        </w:tc>
-        <w:tc>
-          <w:tcPr>
-            <w:tcW w:type="dxa" w:w="3022"/>
-          </w:tcPr>
-          <w:p>
-            <w:pPr>
-              <w:jc w:val="center"/>
-            </w:pPr>
-            <w:r>
-              <w:rPr>
-                <w:sz w:val="20"/>
-              </w:rPr>
-              <w:t>0.04</w:t>
-            </w:r>
-          </w:p>
-        </w:tc>
-        <w:tc>
-          <w:tcPr>
-            <w:tcW w:type="dxa" w:w="3022"/>
-          </w:tcPr>
-          <w:p>
-            <w:pPr>
-              <w:jc w:val="center"/>
-            </w:pPr>
-            <w:r>
-              <w:rPr>
-                <w:sz w:val="20"/>
-              </w:rPr>
-              <w:t>0.65</w:t>
-            </w:r>
-          </w:p>
-        </w:tc>
-      </w:tr>
-      <w:tr>
-        <w:tc>
-          <w:tcPr>
-            <w:tcW w:type="dxa" w:w="3022"/>
-          </w:tcPr>
-          <w:p>
-            <w:pPr>
-              <w:jc w:val="center"/>
-            </w:pPr>
-            <w:r>
-              <w:rPr>
-                <w:sz w:val="20"/>
-              </w:rPr>
-              <w:t>Missing values</w:t>
-            </w:r>
-          </w:p>
-        </w:tc>
-        <w:tc>
-          <w:tcPr>
-            <w:tcW w:type="dxa" w:w="3022"/>
-          </w:tcPr>
-          <w:p>
-            <w:pPr>
-              <w:jc w:val="center"/>
-            </w:pPr>
-            <w:r>
-              <w:rPr>
-                <w:sz w:val="20"/>
-              </w:rPr>
-              <w:t>0</w:t>
-            </w:r>
-          </w:p>
-        </w:tc>
-        <w:tc>
-          <w:tcPr>
-            <w:tcW w:type="dxa" w:w="3022"/>
-          </w:tcPr>
-          <w:p>
-            <w:pPr>
-              <w:jc w:val="center"/>
-            </w:pPr>
-            <w:r>
-              <w:rPr>
-                <w:sz w:val="20"/>
-              </w:rPr>
-              <w:t>0</w:t>
+              <w:t>7.27 / 0.65</w:t>
             </w:r>
           </w:p>
         </w:tc>
       </w:tr>
     </w:tbl>
-    <w:p/>
     <w:p>
       <w:pPr>
-        <w:jc w:val="center"/>
+        <w:spacing w:after="40"/>
+      </w:pPr>
+    </w:p>
+    <w:p>
+      <w:pPr>
+        <w:pStyle w:val="Heading1"/>
+        <w:spacing w:before="80" w:after="60"/>
+        <w:jc w:val="left"/>
       </w:pPr>
       <w:r>
-        <w:drawing>
-          <wp:inline xmlns:a="http://schemas.openxmlformats.org/drawingml/2006/main" xmlns:pic="http://schemas.openxmlformats.org/drawingml/2006/picture">
-            <wp:extent cx="5303520" cy="1818350"/>
-            <wp:docPr id="1" name="Picture 1"/>
-            <wp:cNvGraphicFramePr>
-              <a:graphicFrameLocks noChangeAspect="1"/>
-            </wp:cNvGraphicFramePr>
-            <a:graphic>
-              <a:graphicData uri="http://schemas.openxmlformats.org/drawingml/2006/picture">
-                <pic:pic>
-                  <pic:nvPicPr>
-                    <pic:cNvPr id="0" name="fig6_target_distribution.png"/>
-                    <pic:cNvPicPr/>
-                  </pic:nvPicPr>
-                  <pic:blipFill>
-                    <a:blip r:embed="rId9"/>
-                    <a:stretch>
-                      <a:fillRect/>
-                    </a:stretch>
-                  </pic:blipFill>
-                  <pic:spPr>
-                    <a:xfrm>
-                      <a:off x="0" y="0"/>
-                      <a:ext cx="5303520" cy="1818350"/>
-                    </a:xfrm>
-                    <a:prstGeom prst="rect"/>
-                  </pic:spPr>
-                </pic:pic>
-              </a:graphicData>
-            </a:graphic>
-          </wp:inline>
-        </w:drawing>
+        <w:t>2. Approach</w:t>
       </w:r>
     </w:p>
     <w:p>
       <w:pPr>
-        <w:spacing w:after="200"/>
-        <w:jc w:val="center"/>
-      </w:pPr>
-      <w:r>
-        <w:rPr>
-          <w:i/>
-          <w:sz w:val="18"/>
-        </w:rPr>
-        <w:t>Figure 1. Distribution of y in both training sets.</w:t>
-      </w:r>
-    </w:p>
-    <w:p>
-      <w:r>
-        <w:br w:type="page"/>
-      </w:r>
-    </w:p>
-    <w:p>
-      <w:pPr>
-        <w:pStyle w:val="Heading1"/>
-        <w:jc w:val="left"/>
-      </w:pPr>
-      <w:r>
-        <w:t>3. Approach</w:t>
-      </w:r>
-    </w:p>
-    <w:p>
-      <w:pPr>
-        <w:pStyle w:val="Heading2"/>
-        <w:jc w:val="left"/>
-      </w:pPr>
-      <w:r>
-        <w:t>3.1 Why polynomial regression with Ridge?</w:t>
-      </w:r>
-    </w:p>
-    <w:p>
-      <w:pPr>
-        <w:spacing w:before="40" w:after="120"/>
+        <w:spacing w:before="40" w:after="80"/>
         <w:jc w:val="left"/>
       </w:pPr>
       <w:r>
@@ -785,12 +371,12 @@
           <w:i w:val="0"/>
           <w:sz w:val="22"/>
         </w:rPr>
-        <w:t>The assignment says to use polynomial regression, so the core idea is to take the original features and expand them into all possible products and powers up to some degree d — for example with two features x1 and x2 and degree 2 you'd get x1, x2, x1^2, x1*x2, and x2^2. Then you fit a linear model on top of these expanded features. I used sklearn's PolynomialFeatures for this.</w:t>
+        <w:t>I used polynomial Ridge regression throughout. The idea is to expand the original features into all monomials up to degree d (using sklearn's PolynomialFeatures), then fit a Ridge-regularised linear model on top. Ridge was chosen over plain OLS because at higher degrees the number of features grows large and OLS becomes unstable. Lasso was ruled out because polynomial features are inherently correlated and L1 handles that poorly.</w:t>
       </w:r>
     </w:p>
     <w:p>
       <w:pPr>
-        <w:spacing w:before="40" w:after="120"/>
+        <w:spacing w:before="40" w:after="80"/>
         <w:jc w:val="left"/>
       </w:pPr>
       <w:r>
@@ -799,12 +385,32 @@
           <w:i w:val="0"/>
           <w:sz w:val="22"/>
         </w:rPr>
-        <w:t>The tricky part is that as the degree goes up, the number of features explodes fast. At degree 5 with 6 input features you already have 461 polynomial features for 1000 training samples. Plain linear regression (ordinary least squares) becomes unstable in this kind of situation — it tends to find extreme coefficients and overfit badly. So I used Ridge regression instead, which adds an L2 penalty on the coefficient magnitudes. This keeps things from going haywire and usually generalises much better.</w:t>
+        <w:t>There are two things to tune: the degree d and the Ridge penalty alpha. I ran a coarse grid search (degrees × 13 log-spaced alpha values, evaluated with 5-fold CV) to find a promising region, then did a finer alpha sweep around the winner. I also checked neighbouring degrees at the best alpha, and ran sklearn's RidgeCV as an independent check. Whichever alpha gave the lower CV MSE was used. The model was then refitted on all 1000 training samples to generate the final test predictions.</w:t>
       </w:r>
     </w:p>
     <w:p>
       <w:pPr>
-        <w:spacing w:before="40" w:after="120"/>
+        <w:pStyle w:val="Heading1"/>
+        <w:spacing w:before="80" w:after="60"/>
+        <w:jc w:val="left"/>
+      </w:pPr>
+      <w:r>
+        <w:t>3. Degree and Regularisation Selection</w:t>
+      </w:r>
+    </w:p>
+    <w:p>
+      <w:pPr>
+        <w:pStyle w:val="Heading2"/>
+        <w:spacing w:before="80" w:after="60"/>
+        <w:jc w:val="left"/>
+      </w:pPr>
+      <w:r>
+        <w:t>3.1  Var1 – Steam Turbine (6 features)</w:t>
+      </w:r>
+    </w:p>
+    <w:p>
+      <w:pPr>
+        <w:spacing w:before="40" w:after="80"/>
         <w:jc w:val="left"/>
       </w:pPr>
       <w:r>
@@ -813,112 +419,14 @@
           <w:i w:val="0"/>
           <w:sz w:val="22"/>
         </w:rPr>
-        <w:t>I considered using Lasso as well, but decided against it. Polynomial features are inherently correlated with each other (e.g., x1^2 and x1*x1 are literally the same), and Lasso tends to behave unpredictably when features are strongly correlated. Ridge handles this more gracefully.</w:t>
+        <w:t>The coarse search over degrees 2–6 made the structure pretty clear. Degree 2 and 3 underfit noticeably. Things improve at degree 4 and peak at degree 5 — but only with a strong enough penalty. At low alpha, degree 5 overfits and actually does worse than degree 4. Once alpha is raised to around 2.5, degree 5 beats degree 4 by about 30% in CV MSE. Degree 6 gets worse again despite having more features.</w:t>
       </w:r>
     </w:p>
     <w:p>
       <w:pPr>
-        <w:pStyle w:val="Heading2"/>
-        <w:jc w:val="left"/>
+        <w:spacing w:after="40"/>
       </w:pPr>
-      <w:r>
-        <w:t>3.2 How I picked the degree and regularisation strength</w:t>
-      </w:r>
     </w:p>
-    <w:p>
-      <w:pPr>
-        <w:spacing w:before="40" w:after="120"/>
-        <w:jc w:val="left"/>
-      </w:pPr>
-      <w:r>
-        <w:rPr>
-          <w:b w:val="0"/>
-          <w:i w:val="0"/>
-          <w:sz w:val="22"/>
-        </w:rPr>
-        <w:t>There are two things to tune: the polynomial degree d, and the Ridge penalty strength alpha. I treated this as a two-dimensional search problem and used 5-fold cross-validation to evaluate each combination. The idea was to start broad and then zoom in.</w:t>
-      </w:r>
-    </w:p>
-    <w:p>
-      <w:pPr>
-        <w:spacing w:before="40" w:after="120"/>
-        <w:jc w:val="left"/>
-      </w:pPr>
-      <w:r>
-        <w:rPr>
-          <w:b w:val="0"/>
-          <w:i w:val="0"/>
-          <w:sz w:val="22"/>
-        </w:rPr>
-        <w:t>First I ran a coarse grid search — for var1 I tried degrees 2 through 6, and for var2 degrees 4 through 13, each combined with 13 log-spaced alpha values spread from very small to very large. This gave me a rough sense of where the best region was. Then I did a much finer sweep of alpha values around the winner from the coarse search, and also checked whether neighbouring degrees (±1 for var1, ±2 for var2) did better at that alpha. Finally I ran sklearn's RidgeCV as an independent check — it has its own efficient built-in cross-validation for alpha selection — and I used whichever alpha gave the lower validation MSE.</w:t>
-      </w:r>
-    </w:p>
-    <w:p>
-      <w:pPr>
-        <w:spacing w:before="40" w:after="120"/>
-        <w:jc w:val="left"/>
-      </w:pPr>
-      <w:r>
-        <w:rPr>
-          <w:b w:val="0"/>
-          <w:i w:val="0"/>
-          <w:sz w:val="22"/>
-        </w:rPr>
-        <w:t>Once I had the final (degree, alpha) pair, I retrained the model on the full 1000 training samples and generated predictions for the test set.</w:t>
-      </w:r>
-    </w:p>
-    <w:p>
-      <w:r>
-        <w:br w:type="page"/>
-      </w:r>
-    </w:p>
-    <w:p>
-      <w:pPr>
-        <w:pStyle w:val="Heading1"/>
-        <w:jc w:val="left"/>
-      </w:pPr>
-      <w:r>
-        <w:t>4. Degree Selection and Results</w:t>
-      </w:r>
-    </w:p>
-    <w:p>
-      <w:pPr>
-        <w:pStyle w:val="Heading2"/>
-        <w:jc w:val="left"/>
-      </w:pPr>
-      <w:r>
-        <w:t>4.1 Var1 – Steam Turbine</w:t>
-      </w:r>
-    </w:p>
-    <w:p>
-      <w:pPr>
-        <w:spacing w:before="40" w:after="120"/>
-        <w:jc w:val="left"/>
-      </w:pPr>
-      <w:r>
-        <w:rPr>
-          <w:b w:val="0"/>
-          <w:i w:val="0"/>
-          <w:sz w:val="22"/>
-        </w:rPr>
-        <w:t>For var1 the coarse search made it pretty clear that the data has a degree-5 structure. At lower degrees the model noticeably underfits — degree 2 barely gets an R2 of 0.69 and degree 3 sits around 0.91. Things improve steadily through degree 4 and 5. Degree 6 actually starts getting worse again despite having more features, which tells you the model is starting to overfit.</w:t>
-      </w:r>
-    </w:p>
-    <w:p>
-      <w:pPr>
-        <w:spacing w:before="40" w:after="120"/>
-        <w:jc w:val="left"/>
-      </w:pPr>
-      <w:r>
-        <w:rPr>
-          <w:b w:val="0"/>
-          <w:i w:val="0"/>
-          <w:sz w:val="22"/>
-        </w:rPr>
-        <w:t>One thing that surprised me a bit: at a very low alpha, degree 5 actually performs worse than degree 4. But once you crank the regularisation up to around alpha = 2.5, degree 5 clearly wins. The 461 polynomial features need a fairly strong penalty to stay in check. The fine alpha sweep confirmed that the sweet spot is around 2.47.</w:t>
-      </w:r>
-    </w:p>
-    <w:p/>
     <w:tbl>
       <w:tblPr>
         <w:tblStyle w:val="TableGrid"/>
@@ -945,7 +453,7 @@
             <w:r>
               <w:rPr>
                 <w:b/>
-                <w:sz w:val="20"/>
+                <w:sz w:val="19"/>
               </w:rPr>
               <w:t>Degree</w:t>
             </w:r>
@@ -962,9 +470,9 @@
             <w:r>
               <w:rPr>
                 <w:b/>
-                <w:sz w:val="20"/>
+                <w:sz w:val="19"/>
               </w:rPr>
-              <w:t>Best alpha tried</w:t>
+              <w:t>Best alpha</w:t>
             </w:r>
           </w:p>
         </w:tc>
@@ -979,7 +487,7 @@
             <w:r>
               <w:rPr>
                 <w:b/>
-                <w:sz w:val="20"/>
+                <w:sz w:val="19"/>
               </w:rPr>
               <w:t>CV MSE</w:t>
             </w:r>
@@ -996,9 +504,9 @@
             <w:r>
               <w:rPr>
                 <w:b/>
-                <w:sz w:val="20"/>
+                <w:sz w:val="19"/>
               </w:rPr>
-              <w:t>CV R2</w:t>
+              <w:t>CV R²</w:t>
             </w:r>
           </w:p>
         </w:tc>
@@ -1013,9 +521,9 @@
             <w:r>
               <w:rPr>
                 <w:b/>
-                <w:sz w:val="20"/>
+                <w:sz w:val="19"/>
               </w:rPr>
-              <w:t>No. of features</w:t>
+              <w:t>No. features</w:t>
             </w:r>
           </w:p>
         </w:tc>
@@ -1031,7 +539,7 @@
             </w:pPr>
             <w:r>
               <w:rPr>
-                <w:sz w:val="20"/>
+                <w:sz w:val="19"/>
               </w:rPr>
               <w:t>2</w:t>
             </w:r>
@@ -1047,7 +555,7 @@
             </w:pPr>
             <w:r>
               <w:rPr>
-                <w:sz w:val="20"/>
+                <w:sz w:val="19"/>
               </w:rPr>
               <w:t>1.0</w:t>
             </w:r>
@@ -1063,7 +571,7 @@
             </w:pPr>
             <w:r>
               <w:rPr>
-                <w:sz w:val="20"/>
+                <w:sz w:val="19"/>
               </w:rPr>
               <w:t>3.21</w:t>
             </w:r>
@@ -1079,7 +587,7 @@
             </w:pPr>
             <w:r>
               <w:rPr>
-                <w:sz w:val="20"/>
+                <w:sz w:val="19"/>
               </w:rPr>
               <w:t>0.69</w:t>
             </w:r>
@@ -1095,7 +603,7 @@
             </w:pPr>
             <w:r>
               <w:rPr>
-                <w:sz w:val="20"/>
+                <w:sz w:val="19"/>
               </w:rPr>
               <w:t>27</w:t>
             </w:r>
@@ -1113,7 +621,7 @@
             </w:pPr>
             <w:r>
               <w:rPr>
-                <w:sz w:val="20"/>
+                <w:sz w:val="19"/>
               </w:rPr>
               <w:t>3</w:t>
             </w:r>
@@ -1129,7 +637,7 @@
             </w:pPr>
             <w:r>
               <w:rPr>
-                <w:sz w:val="20"/>
+                <w:sz w:val="19"/>
               </w:rPr>
               <w:t>1.0</w:t>
             </w:r>
@@ -1145,7 +653,7 @@
             </w:pPr>
             <w:r>
               <w:rPr>
-                <w:sz w:val="20"/>
+                <w:sz w:val="19"/>
               </w:rPr>
               <w:t>0.91</w:t>
             </w:r>
@@ -1161,7 +669,7 @@
             </w:pPr>
             <w:r>
               <w:rPr>
-                <w:sz w:val="20"/>
+                <w:sz w:val="19"/>
               </w:rPr>
               <w:t>0.91</w:t>
             </w:r>
@@ -1177,7 +685,7 @@
             </w:pPr>
             <w:r>
               <w:rPr>
-                <w:sz w:val="20"/>
+                <w:sz w:val="19"/>
               </w:rPr>
               <w:t>83</w:t>
             </w:r>
@@ -1195,7 +703,7 @@
             </w:pPr>
             <w:r>
               <w:rPr>
-                <w:sz w:val="20"/>
+                <w:sz w:val="19"/>
               </w:rPr>
               <w:t>4</w:t>
             </w:r>
@@ -1211,7 +719,7 @@
             </w:pPr>
             <w:r>
               <w:rPr>
-                <w:sz w:val="20"/>
+                <w:sz w:val="19"/>
               </w:rPr>
               <w:t>3.16</w:t>
             </w:r>
@@ -1227,7 +735,7 @@
             </w:pPr>
             <w:r>
               <w:rPr>
-                <w:sz w:val="20"/>
+                <w:sz w:val="19"/>
               </w:rPr>
               <w:t>0.69</w:t>
             </w:r>
@@ -1243,7 +751,7 @@
             </w:pPr>
             <w:r>
               <w:rPr>
-                <w:sz w:val="20"/>
+                <w:sz w:val="19"/>
               </w:rPr>
               <w:t>0.93</w:t>
             </w:r>
@@ -1259,7 +767,7 @@
             </w:pPr>
             <w:r>
               <w:rPr>
-                <w:sz w:val="20"/>
+                <w:sz w:val="19"/>
               </w:rPr>
               <w:t>209</w:t>
             </w:r>
@@ -1277,7 +785,7 @@
             </w:pPr>
             <w:r>
               <w:rPr>
-                <w:sz w:val="20"/>
+                <w:sz w:val="19"/>
               </w:rPr>
               <w:t>5</w:t>
             </w:r>
@@ -1293,7 +801,7 @@
             </w:pPr>
             <w:r>
               <w:rPr>
-                <w:sz w:val="20"/>
+                <w:sz w:val="19"/>
               </w:rPr>
               <w:t>2.477</w:t>
             </w:r>
@@ -1309,7 +817,7 @@
             </w:pPr>
             <w:r>
               <w:rPr>
-                <w:sz w:val="20"/>
+                <w:sz w:val="19"/>
               </w:rPr>
               <w:t>0.49</w:t>
             </w:r>
@@ -1325,7 +833,7 @@
             </w:pPr>
             <w:r>
               <w:rPr>
-                <w:sz w:val="20"/>
+                <w:sz w:val="19"/>
               </w:rPr>
               <w:t>0.95</w:t>
             </w:r>
@@ -1341,7 +849,7 @@
             </w:pPr>
             <w:r>
               <w:rPr>
-                <w:sz w:val="20"/>
+                <w:sz w:val="19"/>
               </w:rPr>
               <w:t>461</w:t>
             </w:r>
@@ -1359,7 +867,7 @@
             </w:pPr>
             <w:r>
               <w:rPr>
-                <w:sz w:val="20"/>
+                <w:sz w:val="19"/>
               </w:rPr>
               <w:t>6</w:t>
             </w:r>
@@ -1375,7 +883,7 @@
             </w:pPr>
             <w:r>
               <w:rPr>
-                <w:sz w:val="20"/>
+                <w:sz w:val="19"/>
               </w:rPr>
               <w:t>3.16</w:t>
             </w:r>
@@ -1391,7 +899,7 @@
             </w:pPr>
             <w:r>
               <w:rPr>
-                <w:sz w:val="20"/>
+                <w:sz w:val="19"/>
               </w:rPr>
               <w:t>0.54</w:t>
             </w:r>
@@ -1407,7 +915,7 @@
             </w:pPr>
             <w:r>
               <w:rPr>
-                <w:sz w:val="20"/>
+                <w:sz w:val="19"/>
               </w:rPr>
               <w:t>0.95</w:t>
             </w:r>
@@ -1423,7 +931,7 @@
             </w:pPr>
             <w:r>
               <w:rPr>
-                <w:sz w:val="20"/>
+                <w:sz w:val="19"/>
               </w:rPr>
               <w:t>923</w:t>
             </w:r>
@@ -1431,10 +939,38 @@
         </w:tc>
       </w:tr>
     </w:tbl>
-    <w:p/>
+    <w:p>
+      <w:pPr>
+        <w:spacing w:after="40"/>
+      </w:pPr>
+    </w:p>
     <w:p>
       <w:pPr>
         <w:spacing w:before="40" w:after="120"/>
+        <w:jc w:val="left"/>
+      </w:pPr>
+      <w:r>
+        <w:rPr>
+          <w:b/>
+          <w:i w:val="0"/>
+          <w:sz w:val="22"/>
+        </w:rPr>
+        <w:t>Final choice: degree = 5, alpha = 2.477  (RidgeCV confirmed).</w:t>
+      </w:r>
+    </w:p>
+    <w:p>
+      <w:pPr>
+        <w:pStyle w:val="Heading2"/>
+        <w:spacing w:before="80" w:after="60"/>
+        <w:jc w:val="left"/>
+      </w:pPr>
+      <w:r>
+        <w:t>3.2  Var2 – Thermal Reservoir (3 features)</w:t>
+      </w:r>
+    </w:p>
+    <w:p>
+      <w:pPr>
+        <w:spacing w:before="40" w:after="80"/>
         <w:jc w:val="left"/>
       </w:pPr>
       <w:r>
@@ -1443,152 +979,14 @@
           <w:i w:val="0"/>
           <w:sz w:val="22"/>
         </w:rPr>
-        <w:t>Final choice for var1: degree 5, alpha = 2.477.</w:t>
-      </w:r>
-    </w:p>
-    <w:p/>
-    <w:p>
-      <w:pPr>
-        <w:jc w:val="center"/>
-      </w:pPr>
-      <w:r>
-        <w:drawing>
-          <wp:inline xmlns:a="http://schemas.openxmlformats.org/drawingml/2006/main" xmlns:pic="http://schemas.openxmlformats.org/drawingml/2006/picture">
-            <wp:extent cx="5303520" cy="2044158"/>
-            <wp:docPr id="2" name="Picture 2"/>
-            <wp:cNvGraphicFramePr>
-              <a:graphicFrameLocks noChangeAspect="1"/>
-            </wp:cNvGraphicFramePr>
-            <a:graphic>
-              <a:graphicData uri="http://schemas.openxmlformats.org/drawingml/2006/picture">
-                <pic:pic>
-                  <pic:nvPicPr>
-                    <pic:cNvPr id="0" name="fig1_degree_selection.png"/>
-                    <pic:cNvPicPr/>
-                  </pic:nvPicPr>
-                  <pic:blipFill>
-                    <a:blip r:embed="rId10"/>
-                    <a:stretch>
-                      <a:fillRect/>
-                    </a:stretch>
-                  </pic:blipFill>
-                  <pic:spPr>
-                    <a:xfrm>
-                      <a:off x="0" y="0"/>
-                      <a:ext cx="5303520" cy="2044158"/>
-                    </a:xfrm>
-                    <a:prstGeom prst="rect"/>
-                  </pic:spPr>
-                </pic:pic>
-              </a:graphicData>
-            </a:graphic>
-          </wp:inline>
-        </w:drawing>
+        <w:t>With only 3 input features, polynomial expansion is slower — degree 12 still gives just 454 features, well within what Ridge can handle. The search showed steady improvement from degree 4 all the way to degree 12, after which CV MSE starts creeping up again. The optimal alpha here is much smaller (0.23) because the feature space is less redundant.</w:t>
       </w:r>
     </w:p>
     <w:p>
       <w:pPr>
-        <w:spacing w:after="200"/>
-        <w:jc w:val="center"/>
+        <w:spacing w:after="40"/>
       </w:pPr>
-      <w:r>
-        <w:rPr>
-          <w:i/>
-          <w:sz w:val="18"/>
-        </w:rPr>
-        <w:t>Figure 2. How CV MSE changes with polynomial degree for both problems. The dashed line marks the selected degree.</w:t>
-      </w:r>
     </w:p>
-    <w:p>
-      <w:pPr>
-        <w:jc w:val="center"/>
-      </w:pPr>
-      <w:r>
-        <w:drawing>
-          <wp:inline xmlns:a="http://schemas.openxmlformats.org/drawingml/2006/main" xmlns:pic="http://schemas.openxmlformats.org/drawingml/2006/picture">
-            <wp:extent cx="5303520" cy="2041187"/>
-            <wp:docPr id="3" name="Picture 3"/>
-            <wp:cNvGraphicFramePr>
-              <a:graphicFrameLocks noChangeAspect="1"/>
-            </wp:cNvGraphicFramePr>
-            <a:graphic>
-              <a:graphicData uri="http://schemas.openxmlformats.org/drawingml/2006/picture">
-                <pic:pic>
-                  <pic:nvPicPr>
-                    <pic:cNvPr id="0" name="fig2_alpha_selection.png"/>
-                    <pic:cNvPicPr/>
-                  </pic:nvPicPr>
-                  <pic:blipFill>
-                    <a:blip r:embed="rId11"/>
-                    <a:stretch>
-                      <a:fillRect/>
-                    </a:stretch>
-                  </pic:blipFill>
-                  <pic:spPr>
-                    <a:xfrm>
-                      <a:off x="0" y="0"/>
-                      <a:ext cx="5303520" cy="2041187"/>
-                    </a:xfrm>
-                    <a:prstGeom prst="rect"/>
-                  </pic:spPr>
-                </pic:pic>
-              </a:graphicData>
-            </a:graphic>
-          </wp:inline>
-        </w:drawing>
-      </w:r>
-    </w:p>
-    <w:p>
-      <w:pPr>
-        <w:spacing w:after="200"/>
-        <w:jc w:val="center"/>
-      </w:pPr>
-      <w:r>
-        <w:rPr>
-          <w:i/>
-          <w:sz w:val="18"/>
-        </w:rPr>
-        <w:t>Figure 3. CV MSE as a function of Ridge alpha at the chosen degree. The dashed line marks the selected alpha.</w:t>
-      </w:r>
-    </w:p>
-    <w:p>
-      <w:pPr>
-        <w:pStyle w:val="Heading2"/>
-        <w:jc w:val="left"/>
-      </w:pPr>
-      <w:r>
-        <w:t>4.2 Var2 – Thermal Reservoir</w:t>
-      </w:r>
-    </w:p>
-    <w:p>
-      <w:pPr>
-        <w:spacing w:before="40" w:after="120"/>
-        <w:jc w:val="left"/>
-      </w:pPr>
-      <w:r>
-        <w:rPr>
-          <w:b w:val="0"/>
-          <w:i w:val="0"/>
-          <w:sz w:val="22"/>
-        </w:rPr>
-        <w:t>Var2 is different because there are only 3 input features, so polynomial features grow much slower. At degree 12 you still only have 454 features, which is very manageable. This meant I could go to much higher degrees without things blowing up.</w:t>
-      </w:r>
-    </w:p>
-    <w:p>
-      <w:pPr>
-        <w:spacing w:before="40" w:after="120"/>
-        <w:jc w:val="left"/>
-      </w:pPr>
-      <w:r>
-        <w:rPr>
-          <w:b w:val="0"/>
-          <w:i w:val="0"/>
-          <w:sz w:val="22"/>
-        </w:rPr>
-        <w:t>The search showed a steady and clear improvement all the way from degree 4 up to degree 12. After that the validation MSE starts creeping back up, so degree 12 is where things peak. The R2 at degree 12 is 0.9949 which is really quite good — the model is capturing almost all the variance in the data. I also noticed that for this problem, the optimal alpha is much smaller (around 0.23) because the features are fewer and less redundant at each degree.</w:t>
-      </w:r>
-    </w:p>
-    <w:p/>
     <w:tbl>
       <w:tblPr>
         <w:tblStyle w:val="TableGrid"/>
@@ -1615,7 +1013,7 @@
             <w:r>
               <w:rPr>
                 <w:b/>
-                <w:sz w:val="20"/>
+                <w:sz w:val="19"/>
               </w:rPr>
               <w:t>Degree</w:t>
             </w:r>
@@ -1632,9 +1030,9 @@
             <w:r>
               <w:rPr>
                 <w:b/>
-                <w:sz w:val="20"/>
+                <w:sz w:val="19"/>
               </w:rPr>
-              <w:t>Best alpha tried</w:t>
+              <w:t>Best alpha</w:t>
             </w:r>
           </w:p>
         </w:tc>
@@ -1649,7 +1047,7 @@
             <w:r>
               <w:rPr>
                 <w:b/>
-                <w:sz w:val="20"/>
+                <w:sz w:val="19"/>
               </w:rPr>
               <w:t>CV MSE</w:t>
             </w:r>
@@ -1666,9 +1064,9 @@
             <w:r>
               <w:rPr>
                 <w:b/>
-                <w:sz w:val="20"/>
+                <w:sz w:val="19"/>
               </w:rPr>
-              <w:t>CV R2</w:t>
+              <w:t>CV R²</w:t>
             </w:r>
           </w:p>
         </w:tc>
@@ -1683,9 +1081,9 @@
             <w:r>
               <w:rPr>
                 <w:b/>
-                <w:sz w:val="20"/>
+                <w:sz w:val="19"/>
               </w:rPr>
-              <w:t>No. of features</w:t>
+              <w:t>No. features</w:t>
             </w:r>
           </w:p>
         </w:tc>
@@ -1701,9 +1099,9 @@
             </w:pPr>
             <w:r>
               <w:rPr>
-                <w:sz w:val="20"/>
+                <w:sz w:val="19"/>
               </w:rPr>
-              <w:t>7</w:t>
+              <w:t>8</w:t>
             </w:r>
           </w:p>
         </w:tc>
@@ -1717,7 +1115,7 @@
             </w:pPr>
             <w:r>
               <w:rPr>
-                <w:sz w:val="20"/>
+                <w:sz w:val="19"/>
               </w:rPr>
               <w:t>0.01</w:t>
             </w:r>
@@ -1733,9 +1131,9 @@
             </w:pPr>
             <w:r>
               <w:rPr>
-                <w:sz w:val="20"/>
+                <w:sz w:val="19"/>
               </w:rPr>
-              <w:t>0.33</w:t>
+              <w:t>0.28</w:t>
             </w:r>
           </w:p>
         </w:tc>
@@ -1749,7 +1147,7 @@
             </w:pPr>
             <w:r>
               <w:rPr>
-                <w:sz w:val="20"/>
+                <w:sz w:val="19"/>
               </w:rPr>
               <w:t>0.994</w:t>
             </w:r>
@@ -1765,89 +1163,7 @@
             </w:pPr>
             <w:r>
               <w:rPr>
-                <w:sz w:val="20"/>
-              </w:rPr>
-              <w:t>120</w:t>
-            </w:r>
-          </w:p>
-        </w:tc>
-      </w:tr>
-      <w:tr>
-        <w:tc>
-          <w:tcPr>
-            <w:tcW w:type="dxa" w:w="1813"/>
-          </w:tcPr>
-          <w:p>
-            <w:pPr>
-              <w:jc w:val="center"/>
-            </w:pPr>
-            <w:r>
-              <w:rPr>
-                <w:sz w:val="20"/>
-              </w:rPr>
-              <w:t>8</w:t>
-            </w:r>
-          </w:p>
-        </w:tc>
-        <w:tc>
-          <w:tcPr>
-            <w:tcW w:type="dxa" w:w="1813"/>
-          </w:tcPr>
-          <w:p>
-            <w:pPr>
-              <w:jc w:val="center"/>
-            </w:pPr>
-            <w:r>
-              <w:rPr>
-                <w:sz w:val="20"/>
-              </w:rPr>
-              <w:t>0.01</w:t>
-            </w:r>
-          </w:p>
-        </w:tc>
-        <w:tc>
-          <w:tcPr>
-            <w:tcW w:type="dxa" w:w="1813"/>
-          </w:tcPr>
-          <w:p>
-            <w:pPr>
-              <w:jc w:val="center"/>
-            </w:pPr>
-            <w:r>
-              <w:rPr>
-                <w:sz w:val="20"/>
-              </w:rPr>
-              <w:t>0.28</w:t>
-            </w:r>
-          </w:p>
-        </w:tc>
-        <w:tc>
-          <w:tcPr>
-            <w:tcW w:type="dxa" w:w="1813"/>
-          </w:tcPr>
-          <w:p>
-            <w:pPr>
-              <w:jc w:val="center"/>
-            </w:pPr>
-            <w:r>
-              <w:rPr>
-                <w:sz w:val="20"/>
-              </w:rPr>
-              <w:t>0.994</w:t>
-            </w:r>
-          </w:p>
-        </w:tc>
-        <w:tc>
-          <w:tcPr>
-            <w:tcW w:type="dxa" w:w="1813"/>
-          </w:tcPr>
-          <w:p>
-            <w:pPr>
-              <w:jc w:val="center"/>
-            </w:pPr>
-            <w:r>
-              <w:rPr>
-                <w:sz w:val="20"/>
+                <w:sz w:val="19"/>
               </w:rPr>
               <w:t>165</w:t>
             </w:r>
@@ -1865,7 +1181,7 @@
             </w:pPr>
             <w:r>
               <w:rPr>
-                <w:sz w:val="20"/>
+                <w:sz w:val="19"/>
               </w:rPr>
               <w:t>9</w:t>
             </w:r>
@@ -1881,7 +1197,7 @@
             </w:pPr>
             <w:r>
               <w:rPr>
-                <w:sz w:val="20"/>
+                <w:sz w:val="19"/>
               </w:rPr>
               <w:t>0.01</w:t>
             </w:r>
@@ -1897,7 +1213,7 @@
             </w:pPr>
             <w:r>
               <w:rPr>
-                <w:sz w:val="20"/>
+                <w:sz w:val="19"/>
               </w:rPr>
               <w:t>0.27</w:t>
             </w:r>
@@ -1913,7 +1229,7 @@
             </w:pPr>
             <w:r>
               <w:rPr>
-                <w:sz w:val="20"/>
+                <w:sz w:val="19"/>
               </w:rPr>
               <w:t>0.995</w:t>
             </w:r>
@@ -1929,7 +1245,7 @@
             </w:pPr>
             <w:r>
               <w:rPr>
-                <w:sz w:val="20"/>
+                <w:sz w:val="19"/>
               </w:rPr>
               <w:t>220</w:t>
             </w:r>
@@ -1947,7 +1263,7 @@
             </w:pPr>
             <w:r>
               <w:rPr>
-                <w:sz w:val="20"/>
+                <w:sz w:val="19"/>
               </w:rPr>
               <w:t>10</w:t>
             </w:r>
@@ -1963,7 +1279,7 @@
             </w:pPr>
             <w:r>
               <w:rPr>
-                <w:sz w:val="20"/>
+                <w:sz w:val="19"/>
               </w:rPr>
               <w:t>0.10</w:t>
             </w:r>
@@ -1979,7 +1295,7 @@
             </w:pPr>
             <w:r>
               <w:rPr>
-                <w:sz w:val="20"/>
+                <w:sz w:val="19"/>
               </w:rPr>
               <w:t>0.27</w:t>
             </w:r>
@@ -1995,7 +1311,7 @@
             </w:pPr>
             <w:r>
               <w:rPr>
-                <w:sz w:val="20"/>
+                <w:sz w:val="19"/>
               </w:rPr>
               <w:t>0.995</w:t>
             </w:r>
@@ -2011,7 +1327,7 @@
             </w:pPr>
             <w:r>
               <w:rPr>
-                <w:sz w:val="20"/>
+                <w:sz w:val="19"/>
               </w:rPr>
               <w:t>286</w:t>
             </w:r>
@@ -2029,7 +1345,7 @@
             </w:pPr>
             <w:r>
               <w:rPr>
-                <w:sz w:val="20"/>
+                <w:sz w:val="19"/>
               </w:rPr>
               <w:t>11</w:t>
             </w:r>
@@ -2045,7 +1361,7 @@
             </w:pPr>
             <w:r>
               <w:rPr>
-                <w:sz w:val="20"/>
+                <w:sz w:val="19"/>
               </w:rPr>
               <w:t>0.10</w:t>
             </w:r>
@@ -2061,7 +1377,7 @@
             </w:pPr>
             <w:r>
               <w:rPr>
-                <w:sz w:val="20"/>
+                <w:sz w:val="19"/>
               </w:rPr>
               <w:t>0.27</w:t>
             </w:r>
@@ -2077,7 +1393,7 @@
             </w:pPr>
             <w:r>
               <w:rPr>
-                <w:sz w:val="20"/>
+                <w:sz w:val="19"/>
               </w:rPr>
               <w:t>0.995</w:t>
             </w:r>
@@ -2093,7 +1409,7 @@
             </w:pPr>
             <w:r>
               <w:rPr>
-                <w:sz w:val="20"/>
+                <w:sz w:val="19"/>
               </w:rPr>
               <w:t>364</w:t>
             </w:r>
@@ -2111,7 +1427,7 @@
             </w:pPr>
             <w:r>
               <w:rPr>
-                <w:sz w:val="20"/>
+                <w:sz w:val="19"/>
               </w:rPr>
               <w:t>12</w:t>
             </w:r>
@@ -2127,7 +1443,7 @@
             </w:pPr>
             <w:r>
               <w:rPr>
-                <w:sz w:val="20"/>
+                <w:sz w:val="19"/>
               </w:rPr>
               <w:t>0.231</w:t>
             </w:r>
@@ -2143,7 +1459,7 @@
             </w:pPr>
             <w:r>
               <w:rPr>
-                <w:sz w:val="20"/>
+                <w:sz w:val="19"/>
               </w:rPr>
               <w:t>0.26</w:t>
             </w:r>
@@ -2159,7 +1475,7 @@
             </w:pPr>
             <w:r>
               <w:rPr>
-                <w:sz w:val="20"/>
+                <w:sz w:val="19"/>
               </w:rPr>
               <w:t>0.995</w:t>
             </w:r>
@@ -2175,7 +1491,7 @@
             </w:pPr>
             <w:r>
               <w:rPr>
-                <w:sz w:val="20"/>
+                <w:sz w:val="19"/>
               </w:rPr>
               <w:t>454</w:t>
             </w:r>
@@ -2193,7 +1509,7 @@
             </w:pPr>
             <w:r>
               <w:rPr>
-                <w:sz w:val="20"/>
+                <w:sz w:val="19"/>
               </w:rPr>
               <w:t>13</w:t>
             </w:r>
@@ -2209,7 +1525,7 @@
             </w:pPr>
             <w:r>
               <w:rPr>
-                <w:sz w:val="20"/>
+                <w:sz w:val="19"/>
               </w:rPr>
               <w:t>0.316</w:t>
             </w:r>
@@ -2225,7 +1541,7 @@
             </w:pPr>
             <w:r>
               <w:rPr>
-                <w:sz w:val="20"/>
+                <w:sz w:val="19"/>
               </w:rPr>
               <w:t>0.27</w:t>
             </w:r>
@@ -2241,7 +1557,7 @@
             </w:pPr>
             <w:r>
               <w:rPr>
-                <w:sz w:val="20"/>
+                <w:sz w:val="19"/>
               </w:rPr>
               <w:t>0.995</w:t>
             </w:r>
@@ -2257,100 +1573,98 @@
             </w:pPr>
             <w:r>
               <w:rPr>
-                <w:sz w:val="20"/>
+                <w:sz w:val="19"/>
               </w:rPr>
               <w:t>559</w:t>
             </w:r>
           </w:p>
         </w:tc>
       </w:tr>
-      <w:tr>
-        <w:tc>
-          <w:tcPr>
-            <w:tcW w:type="dxa" w:w="1813"/>
-          </w:tcPr>
-          <w:p>
-            <w:pPr>
-              <w:jc w:val="center"/>
-            </w:pPr>
-            <w:r>
-              <w:rPr>
-                <w:sz w:val="20"/>
-              </w:rPr>
-              <w:t>14</w:t>
-            </w:r>
-          </w:p>
-        </w:tc>
-        <w:tc>
-          <w:tcPr>
-            <w:tcW w:type="dxa" w:w="1813"/>
-          </w:tcPr>
-          <w:p>
-            <w:pPr>
-              <w:jc w:val="center"/>
-            </w:pPr>
-            <w:r>
-              <w:rPr>
-                <w:sz w:val="20"/>
-              </w:rPr>
-              <w:t>0.316</w:t>
-            </w:r>
-          </w:p>
-        </w:tc>
-        <w:tc>
-          <w:tcPr>
-            <w:tcW w:type="dxa" w:w="1813"/>
-          </w:tcPr>
-          <w:p>
-            <w:pPr>
-              <w:jc w:val="center"/>
-            </w:pPr>
-            <w:r>
-              <w:rPr>
-                <w:sz w:val="20"/>
-              </w:rPr>
-              <w:t>0.27</w:t>
-            </w:r>
-          </w:p>
-        </w:tc>
-        <w:tc>
-          <w:tcPr>
-            <w:tcW w:type="dxa" w:w="1813"/>
-          </w:tcPr>
-          <w:p>
-            <w:pPr>
-              <w:jc w:val="center"/>
-            </w:pPr>
-            <w:r>
-              <w:rPr>
-                <w:sz w:val="20"/>
-              </w:rPr>
-              <w:t>0.995</w:t>
-            </w:r>
-          </w:p>
-        </w:tc>
-        <w:tc>
-          <w:tcPr>
-            <w:tcW w:type="dxa" w:w="1813"/>
-          </w:tcPr>
-          <w:p>
-            <w:pPr>
-              <w:jc w:val="center"/>
-            </w:pPr>
-            <w:r>
-              <w:rPr>
-                <w:sz w:val="20"/>
-              </w:rPr>
-              <w:t>680</w:t>
-            </w:r>
-          </w:p>
-        </w:tc>
-      </w:tr>
     </w:tbl>
-    <w:p/>
+    <w:p>
+      <w:pPr>
+        <w:spacing w:after="40"/>
+      </w:pPr>
+    </w:p>
     <w:p>
       <w:pPr>
         <w:spacing w:before="40" w:after="120"/>
+        <w:jc w:val="left"/>
+      </w:pPr>
+      <w:r>
+        <w:rPr>
+          <w:b/>
+          <w:i w:val="0"/>
+          <w:sz w:val="22"/>
+        </w:rPr>
+        <w:t>Final choice: degree = 12, alpha = 0.231  (RidgeCV confirmed).</w:t>
+      </w:r>
+    </w:p>
+    <w:p>
+      <w:pPr>
+        <w:jc w:val="center"/>
+      </w:pPr>
+      <w:r>
+        <w:drawing>
+          <wp:inline xmlns:a="http://schemas.openxmlformats.org/drawingml/2006/main" xmlns:pic="http://schemas.openxmlformats.org/drawingml/2006/picture">
+            <wp:extent cx="5120640" cy="1973670"/>
+            <wp:docPr id="1" name="Picture 1"/>
+            <wp:cNvGraphicFramePr>
+              <a:graphicFrameLocks noChangeAspect="1"/>
+            </wp:cNvGraphicFramePr>
+            <a:graphic>
+              <a:graphicData uri="http://schemas.openxmlformats.org/drawingml/2006/picture">
+                <pic:pic>
+                  <pic:nvPicPr>
+                    <pic:cNvPr id="0" name="fig1_degree_selection.png"/>
+                    <pic:cNvPicPr/>
+                  </pic:nvPicPr>
+                  <pic:blipFill>
+                    <a:blip r:embed="rId9"/>
+                    <a:stretch>
+                      <a:fillRect/>
+                    </a:stretch>
+                  </pic:blipFill>
+                  <pic:spPr>
+                    <a:xfrm>
+                      <a:off x="0" y="0"/>
+                      <a:ext cx="5120640" cy="1973670"/>
+                    </a:xfrm>
+                    <a:prstGeom prst="rect"/>
+                  </pic:spPr>
+                </pic:pic>
+              </a:graphicData>
+            </a:graphic>
+          </wp:inline>
+        </w:drawing>
+      </w:r>
+    </w:p>
+    <w:p>
+      <w:pPr>
+        <w:spacing w:before="20" w:after="120"/>
+        <w:jc w:val="center"/>
+      </w:pPr>
+      <w:r>
+        <w:rPr>
+          <w:i/>
+          <w:sz w:val="18"/>
+        </w:rPr>
+        <w:t>Figure 1. CV MSE vs polynomial degree for both problems. Dashed lines mark the selected degrees.</w:t>
+      </w:r>
+    </w:p>
+    <w:p>
+      <w:pPr>
+        <w:pStyle w:val="Heading1"/>
+        <w:spacing w:before="80" w:after="60"/>
+        <w:jc w:val="left"/>
+      </w:pPr>
+      <w:r>
+        <w:t>4. Results</w:t>
+      </w:r>
+    </w:p>
+    <w:p>
+      <w:pPr>
+        <w:spacing w:before="40" w:after="80"/>
         <w:jc w:val="left"/>
       </w:pPr>
       <w:r>
@@ -2359,47 +1673,14 @@
           <w:i w:val="0"/>
           <w:sz w:val="22"/>
         </w:rPr>
-        <w:t>Final choice for var2: degree 12, alpha = 0.231 (confirmed by RidgeCV).</w:t>
-      </w:r>
-    </w:p>
-    <w:p>
-      <w:r>
-        <w:br w:type="page"/>
+        <w:t>Cross-validation summary for both final models:</w:t>
       </w:r>
     </w:p>
     <w:p>
       <w:pPr>
-        <w:pStyle w:val="Heading1"/>
-        <w:jc w:val="left"/>
+        <w:spacing w:after="40"/>
       </w:pPr>
-      <w:r>
-        <w:t>5. Results</w:t>
-      </w:r>
     </w:p>
-    <w:p>
-      <w:pPr>
-        <w:pStyle w:val="Heading2"/>
-        <w:jc w:val="left"/>
-      </w:pPr>
-      <w:r>
-        <w:t>5.1 Cross-validation summary</w:t>
-      </w:r>
-    </w:p>
-    <w:p>
-      <w:pPr>
-        <w:spacing w:before="40" w:after="120"/>
-        <w:jc w:val="left"/>
-      </w:pPr>
-      <w:r>
-        <w:rPr>
-          <w:b w:val="0"/>
-          <w:i w:val="0"/>
-          <w:sz w:val="22"/>
-        </w:rPr>
-        <w:t>Here is a quick summary of the final cross-validation numbers for both models:</w:t>
-      </w:r>
-    </w:p>
-    <w:p/>
     <w:tbl>
       <w:tblPr>
         <w:tblStyle w:val="TableGrid"/>
@@ -2427,7 +1708,7 @@
             <w:r>
               <w:rPr>
                 <w:b/>
-                <w:sz w:val="20"/>
+                <w:sz w:val="19"/>
               </w:rPr>
               <w:t>Problem</w:t>
             </w:r>
@@ -2444,7 +1725,7 @@
             <w:r>
               <w:rPr>
                 <w:b/>
-                <w:sz w:val="20"/>
+                <w:sz w:val="19"/>
               </w:rPr>
               <w:t>Degree</w:t>
             </w:r>
@@ -2461,7 +1742,7 @@
             <w:r>
               <w:rPr>
                 <w:b/>
-                <w:sz w:val="20"/>
+                <w:sz w:val="19"/>
               </w:rPr>
               <w:t>Alpha</w:t>
             </w:r>
@@ -2478,7 +1759,7 @@
             <w:r>
               <w:rPr>
                 <w:b/>
-                <w:sz w:val="20"/>
+                <w:sz w:val="19"/>
               </w:rPr>
               <w:t>5-fold CV MSE</w:t>
             </w:r>
@@ -2495,9 +1776,9 @@
             <w:r>
               <w:rPr>
                 <w:b/>
-                <w:sz w:val="20"/>
+                <w:sz w:val="19"/>
               </w:rPr>
-              <w:t>5-fold CV R2</w:t>
+              <w:t>5-fold CV R²</w:t>
             </w:r>
           </w:p>
         </w:tc>
@@ -2512,7 +1793,7 @@
             <w:r>
               <w:rPr>
                 <w:b/>
-                <w:sz w:val="20"/>
+                <w:sz w:val="19"/>
               </w:rPr>
               <w:t>Poly features</w:t>
             </w:r>
@@ -2530,9 +1811,9 @@
             </w:pPr>
             <w:r>
               <w:rPr>
-                <w:sz w:val="20"/>
+                <w:sz w:val="19"/>
               </w:rPr>
-              <w:t>Var1 (Steam Turbine)</w:t>
+              <w:t>Var1 – Steam Turbine</w:t>
             </w:r>
           </w:p>
         </w:tc>
@@ -2546,7 +1827,7 @@
             </w:pPr>
             <w:r>
               <w:rPr>
-                <w:sz w:val="20"/>
+                <w:sz w:val="19"/>
               </w:rPr>
               <w:t>5</w:t>
             </w:r>
@@ -2562,7 +1843,7 @@
             </w:pPr>
             <w:r>
               <w:rPr>
-                <w:sz w:val="20"/>
+                <w:sz w:val="19"/>
               </w:rPr>
               <w:t>2.477</w:t>
             </w:r>
@@ -2578,7 +1859,7 @@
             </w:pPr>
             <w:r>
               <w:rPr>
-                <w:sz w:val="20"/>
+                <w:sz w:val="19"/>
               </w:rPr>
               <w:t>0.4925</w:t>
             </w:r>
@@ -2594,7 +1875,7 @@
             </w:pPr>
             <w:r>
               <w:rPr>
-                <w:sz w:val="20"/>
+                <w:sz w:val="19"/>
               </w:rPr>
               <w:t>0.9516</w:t>
             </w:r>
@@ -2610,7 +1891,7 @@
             </w:pPr>
             <w:r>
               <w:rPr>
-                <w:sz w:val="20"/>
+                <w:sz w:val="19"/>
               </w:rPr>
               <w:t>461</w:t>
             </w:r>
@@ -2628,9 +1909,9 @@
             </w:pPr>
             <w:r>
               <w:rPr>
-                <w:sz w:val="20"/>
+                <w:sz w:val="19"/>
               </w:rPr>
-              <w:t>Var2 (Thermal Reservoir)</w:t>
+              <w:t>Var2 – Thermal Reservoir</w:t>
             </w:r>
           </w:p>
         </w:tc>
@@ -2644,7 +1925,7 @@
             </w:pPr>
             <w:r>
               <w:rPr>
-                <w:sz w:val="20"/>
+                <w:sz w:val="19"/>
               </w:rPr>
               <w:t>12</w:t>
             </w:r>
@@ -2660,7 +1941,7 @@
             </w:pPr>
             <w:r>
               <w:rPr>
-                <w:sz w:val="20"/>
+                <w:sz w:val="19"/>
               </w:rPr>
               <w:t>0.231</w:t>
             </w:r>
@@ -2676,7 +1957,7 @@
             </w:pPr>
             <w:r>
               <w:rPr>
-                <w:sz w:val="20"/>
+                <w:sz w:val="19"/>
               </w:rPr>
               <w:t>0.2627</w:t>
             </w:r>
@@ -2692,7 +1973,7 @@
             </w:pPr>
             <w:r>
               <w:rPr>
-                <w:sz w:val="20"/>
+                <w:sz w:val="19"/>
               </w:rPr>
               <w:t>0.9949</w:t>
             </w:r>
@@ -2708,7 +1989,7 @@
             </w:pPr>
             <w:r>
               <w:rPr>
-                <w:sz w:val="20"/>
+                <w:sz w:val="19"/>
               </w:rPr>
               <w:t>454</w:t>
             </w:r>
@@ -2716,19 +1997,14 @@
         </w:tc>
       </w:tr>
     </w:tbl>
-    <w:p/>
     <w:p>
       <w:pPr>
-        <w:pStyle w:val="Heading2"/>
-        <w:jc w:val="left"/>
+        <w:spacing w:after="80"/>
       </w:pPr>
-      <w:r>
-        <w:t>5.2 Per-fold breakdown</w:t>
-      </w:r>
     </w:p>
     <w:p>
       <w:pPr>
-        <w:spacing w:before="40" w:after="120"/>
+        <w:spacing w:before="40" w:after="80"/>
         <w:jc w:val="left"/>
       </w:pPr>
       <w:r>
@@ -2737,845 +2013,7 @@
           <w:i w:val="0"/>
           <w:sz w:val="22"/>
         </w:rPr>
-        <w:t>To make sure the results were consistent and not just lucky on one particular split, here are the numbers across each of the 5 folds:</w:t>
-      </w:r>
-    </w:p>
-    <w:p/>
-    <w:tbl>
-      <w:tblPr>
-        <w:tblStyle w:val="TableGrid"/>
-        <w:tblW w:type="auto" w:w="0"/>
-        <w:jc w:val="center"/>
-        <w:tblLook w:firstColumn="1" w:firstRow="1" w:lastColumn="0" w:lastRow="0" w:noHBand="0" w:noVBand="1" w:val="04A0"/>
-      </w:tblPr>
-      <w:tblGrid>
-        <w:gridCol w:w="1295"/>
-        <w:gridCol w:w="1295"/>
-        <w:gridCol w:w="1295"/>
-        <w:gridCol w:w="1295"/>
-        <w:gridCol w:w="1295"/>
-        <w:gridCol w:w="1295"/>
-        <w:gridCol w:w="1295"/>
-      </w:tblGrid>
-      <w:tr>
-        <w:tc>
-          <w:tcPr>
-            <w:tcW w:type="dxa" w:w="1295"/>
-          </w:tcPr>
-          <w:p>
-            <w:pPr>
-              <w:jc w:val="center"/>
-            </w:pPr>
-            <w:r>
-              <w:rPr>
-                <w:b/>
-                <w:sz w:val="20"/>
-              </w:rPr>
-              <w:t>Fold</w:t>
-            </w:r>
-          </w:p>
-        </w:tc>
-        <w:tc>
-          <w:tcPr>
-            <w:tcW w:type="dxa" w:w="1295"/>
-          </w:tcPr>
-          <w:p>
-            <w:pPr>
-              <w:jc w:val="center"/>
-            </w:pPr>
-            <w:r>
-              <w:rPr>
-                <w:b/>
-                <w:sz w:val="20"/>
-              </w:rPr>
-              <w:t>Var1 train MSE</w:t>
-            </w:r>
-          </w:p>
-        </w:tc>
-        <w:tc>
-          <w:tcPr>
-            <w:tcW w:type="dxa" w:w="1295"/>
-          </w:tcPr>
-          <w:p>
-            <w:pPr>
-              <w:jc w:val="center"/>
-            </w:pPr>
-            <w:r>
-              <w:rPr>
-                <w:b/>
-                <w:sz w:val="20"/>
-              </w:rPr>
-              <w:t>Var1 val MSE</w:t>
-            </w:r>
-          </w:p>
-        </w:tc>
-        <w:tc>
-          <w:tcPr>
-            <w:tcW w:type="dxa" w:w="1295"/>
-          </w:tcPr>
-          <w:p>
-            <w:pPr>
-              <w:jc w:val="center"/>
-            </w:pPr>
-            <w:r>
-              <w:rPr>
-                <w:b/>
-                <w:sz w:val="20"/>
-              </w:rPr>
-              <w:t>Var1 val R2</w:t>
-            </w:r>
-          </w:p>
-        </w:tc>
-        <w:tc>
-          <w:tcPr>
-            <w:tcW w:type="dxa" w:w="1295"/>
-          </w:tcPr>
-          <w:p>
-            <w:pPr>
-              <w:jc w:val="center"/>
-            </w:pPr>
-            <w:r>
-              <w:rPr>
-                <w:b/>
-                <w:sz w:val="20"/>
-              </w:rPr>
-              <w:t>Var2 train MSE</w:t>
-            </w:r>
-          </w:p>
-        </w:tc>
-        <w:tc>
-          <w:tcPr>
-            <w:tcW w:type="dxa" w:w="1295"/>
-          </w:tcPr>
-          <w:p>
-            <w:pPr>
-              <w:jc w:val="center"/>
-            </w:pPr>
-            <w:r>
-              <w:rPr>
-                <w:b/>
-                <w:sz w:val="20"/>
-              </w:rPr>
-              <w:t>Var2 val MSE</w:t>
-            </w:r>
-          </w:p>
-        </w:tc>
-        <w:tc>
-          <w:tcPr>
-            <w:tcW w:type="dxa" w:w="1295"/>
-          </w:tcPr>
-          <w:p>
-            <w:pPr>
-              <w:jc w:val="center"/>
-            </w:pPr>
-            <w:r>
-              <w:rPr>
-                <w:b/>
-                <w:sz w:val="20"/>
-              </w:rPr>
-              <w:t>Var2 val R2</w:t>
-            </w:r>
-          </w:p>
-        </w:tc>
-      </w:tr>
-      <w:tr>
-        <w:tc>
-          <w:tcPr>
-            <w:tcW w:type="dxa" w:w="1295"/>
-          </w:tcPr>
-          <w:p>
-            <w:pPr>
-              <w:jc w:val="center"/>
-            </w:pPr>
-            <w:r>
-              <w:rPr>
-                <w:sz w:val="20"/>
-              </w:rPr>
-              <w:t>1</w:t>
-            </w:r>
-          </w:p>
-        </w:tc>
-        <w:tc>
-          <w:tcPr>
-            <w:tcW w:type="dxa" w:w="1295"/>
-          </w:tcPr>
-          <w:p>
-            <w:pPr>
-              <w:jc w:val="center"/>
-            </w:pPr>
-            <w:r>
-              <w:rPr>
-                <w:sz w:val="20"/>
-              </w:rPr>
-              <w:t>0.185</w:t>
-            </w:r>
-          </w:p>
-        </w:tc>
-        <w:tc>
-          <w:tcPr>
-            <w:tcW w:type="dxa" w:w="1295"/>
-          </w:tcPr>
-          <w:p>
-            <w:pPr>
-              <w:jc w:val="center"/>
-            </w:pPr>
-            <w:r>
-              <w:rPr>
-                <w:sz w:val="20"/>
-              </w:rPr>
-              <w:t>0.452</w:t>
-            </w:r>
-          </w:p>
-        </w:tc>
-        <w:tc>
-          <w:tcPr>
-            <w:tcW w:type="dxa" w:w="1295"/>
-          </w:tcPr>
-          <w:p>
-            <w:pPr>
-              <w:jc w:val="center"/>
-            </w:pPr>
-            <w:r>
-              <w:rPr>
-                <w:sz w:val="20"/>
-              </w:rPr>
-              <w:t>0.953</w:t>
-            </w:r>
-          </w:p>
-        </w:tc>
-        <w:tc>
-          <w:tcPr>
-            <w:tcW w:type="dxa" w:w="1295"/>
-          </w:tcPr>
-          <w:p>
-            <w:pPr>
-              <w:jc w:val="center"/>
-            </w:pPr>
-            <w:r>
-              <w:rPr>
-                <w:sz w:val="20"/>
-              </w:rPr>
-              <w:t>0.170</w:t>
-            </w:r>
-          </w:p>
-        </w:tc>
-        <w:tc>
-          <w:tcPr>
-            <w:tcW w:type="dxa" w:w="1295"/>
-          </w:tcPr>
-          <w:p>
-            <w:pPr>
-              <w:jc w:val="center"/>
-            </w:pPr>
-            <w:r>
-              <w:rPr>
-                <w:sz w:val="20"/>
-              </w:rPr>
-              <w:t>0.249</w:t>
-            </w:r>
-          </w:p>
-        </w:tc>
-        <w:tc>
-          <w:tcPr>
-            <w:tcW w:type="dxa" w:w="1295"/>
-          </w:tcPr>
-          <w:p>
-            <w:pPr>
-              <w:jc w:val="center"/>
-            </w:pPr>
-            <w:r>
-              <w:rPr>
-                <w:sz w:val="20"/>
-              </w:rPr>
-              <w:t>0.994</w:t>
-            </w:r>
-          </w:p>
-        </w:tc>
-      </w:tr>
-      <w:tr>
-        <w:tc>
-          <w:tcPr>
-            <w:tcW w:type="dxa" w:w="1295"/>
-          </w:tcPr>
-          <w:p>
-            <w:pPr>
-              <w:jc w:val="center"/>
-            </w:pPr>
-            <w:r>
-              <w:rPr>
-                <w:sz w:val="20"/>
-              </w:rPr>
-              <w:t>2</w:t>
-            </w:r>
-          </w:p>
-        </w:tc>
-        <w:tc>
-          <w:tcPr>
-            <w:tcW w:type="dxa" w:w="1295"/>
-          </w:tcPr>
-          <w:p>
-            <w:pPr>
-              <w:jc w:val="center"/>
-            </w:pPr>
-            <w:r>
-              <w:rPr>
-                <w:sz w:val="20"/>
-              </w:rPr>
-              <w:t>0.187</w:t>
-            </w:r>
-          </w:p>
-        </w:tc>
-        <w:tc>
-          <w:tcPr>
-            <w:tcW w:type="dxa" w:w="1295"/>
-          </w:tcPr>
-          <w:p>
-            <w:pPr>
-              <w:jc w:val="center"/>
-            </w:pPr>
-            <w:r>
-              <w:rPr>
-                <w:sz w:val="20"/>
-              </w:rPr>
-              <w:t>0.433</w:t>
-            </w:r>
-          </w:p>
-        </w:tc>
-        <w:tc>
-          <w:tcPr>
-            <w:tcW w:type="dxa" w:w="1295"/>
-          </w:tcPr>
-          <w:p>
-            <w:pPr>
-              <w:jc w:val="center"/>
-            </w:pPr>
-            <w:r>
-              <w:rPr>
-                <w:sz w:val="20"/>
-              </w:rPr>
-              <w:t>0.950</w:t>
-            </w:r>
-          </w:p>
-        </w:tc>
-        <w:tc>
-          <w:tcPr>
-            <w:tcW w:type="dxa" w:w="1295"/>
-          </w:tcPr>
-          <w:p>
-            <w:pPr>
-              <w:jc w:val="center"/>
-            </w:pPr>
-            <w:r>
-              <w:rPr>
-                <w:sz w:val="20"/>
-              </w:rPr>
-              <w:t>0.165</w:t>
-            </w:r>
-          </w:p>
-        </w:tc>
-        <w:tc>
-          <w:tcPr>
-            <w:tcW w:type="dxa" w:w="1295"/>
-          </w:tcPr>
-          <w:p>
-            <w:pPr>
-              <w:jc w:val="center"/>
-            </w:pPr>
-            <w:r>
-              <w:rPr>
-                <w:sz w:val="20"/>
-              </w:rPr>
-              <w:t>0.291</w:t>
-            </w:r>
-          </w:p>
-        </w:tc>
-        <w:tc>
-          <w:tcPr>
-            <w:tcW w:type="dxa" w:w="1295"/>
-          </w:tcPr>
-          <w:p>
-            <w:pPr>
-              <w:jc w:val="center"/>
-            </w:pPr>
-            <w:r>
-              <w:rPr>
-                <w:sz w:val="20"/>
-              </w:rPr>
-              <w:t>0.995</w:t>
-            </w:r>
-          </w:p>
-        </w:tc>
-      </w:tr>
-      <w:tr>
-        <w:tc>
-          <w:tcPr>
-            <w:tcW w:type="dxa" w:w="1295"/>
-          </w:tcPr>
-          <w:p>
-            <w:pPr>
-              <w:jc w:val="center"/>
-            </w:pPr>
-            <w:r>
-              <w:rPr>
-                <w:sz w:val="20"/>
-              </w:rPr>
-              <w:t>3</w:t>
-            </w:r>
-          </w:p>
-        </w:tc>
-        <w:tc>
-          <w:tcPr>
-            <w:tcW w:type="dxa" w:w="1295"/>
-          </w:tcPr>
-          <w:p>
-            <w:pPr>
-              <w:jc w:val="center"/>
-            </w:pPr>
-            <w:r>
-              <w:rPr>
-                <w:sz w:val="20"/>
-              </w:rPr>
-              <w:t>0.196</w:t>
-            </w:r>
-          </w:p>
-        </w:tc>
-        <w:tc>
-          <w:tcPr>
-            <w:tcW w:type="dxa" w:w="1295"/>
-          </w:tcPr>
-          <w:p>
-            <w:pPr>
-              <w:jc w:val="center"/>
-            </w:pPr>
-            <w:r>
-              <w:rPr>
-                <w:sz w:val="20"/>
-              </w:rPr>
-              <w:t>0.447</w:t>
-            </w:r>
-          </w:p>
-        </w:tc>
-        <w:tc>
-          <w:tcPr>
-            <w:tcW w:type="dxa" w:w="1295"/>
-          </w:tcPr>
-          <w:p>
-            <w:pPr>
-              <w:jc w:val="center"/>
-            </w:pPr>
-            <w:r>
-              <w:rPr>
-                <w:sz w:val="20"/>
-              </w:rPr>
-              <w:t>0.965</w:t>
-            </w:r>
-          </w:p>
-        </w:tc>
-        <w:tc>
-          <w:tcPr>
-            <w:tcW w:type="dxa" w:w="1295"/>
-          </w:tcPr>
-          <w:p>
-            <w:pPr>
-              <w:jc w:val="center"/>
-            </w:pPr>
-            <w:r>
-              <w:rPr>
-                <w:sz w:val="20"/>
-              </w:rPr>
-              <w:t>0.169</w:t>
-            </w:r>
-          </w:p>
-        </w:tc>
-        <w:tc>
-          <w:tcPr>
-            <w:tcW w:type="dxa" w:w="1295"/>
-          </w:tcPr>
-          <w:p>
-            <w:pPr>
-              <w:jc w:val="center"/>
-            </w:pPr>
-            <w:r>
-              <w:rPr>
-                <w:sz w:val="20"/>
-              </w:rPr>
-              <w:t>0.269</w:t>
-            </w:r>
-          </w:p>
-        </w:tc>
-        <w:tc>
-          <w:tcPr>
-            <w:tcW w:type="dxa" w:w="1295"/>
-          </w:tcPr>
-          <w:p>
-            <w:pPr>
-              <w:jc w:val="center"/>
-            </w:pPr>
-            <w:r>
-              <w:rPr>
-                <w:sz w:val="20"/>
-              </w:rPr>
-              <w:t>0.996</w:t>
-            </w:r>
-          </w:p>
-        </w:tc>
-      </w:tr>
-      <w:tr>
-        <w:tc>
-          <w:tcPr>
-            <w:tcW w:type="dxa" w:w="1295"/>
-          </w:tcPr>
-          <w:p>
-            <w:pPr>
-              <w:jc w:val="center"/>
-            </w:pPr>
-            <w:r>
-              <w:rPr>
-                <w:sz w:val="20"/>
-              </w:rPr>
-              <w:t>4</w:t>
-            </w:r>
-          </w:p>
-        </w:tc>
-        <w:tc>
-          <w:tcPr>
-            <w:tcW w:type="dxa" w:w="1295"/>
-          </w:tcPr>
-          <w:p>
-            <w:pPr>
-              <w:jc w:val="center"/>
-            </w:pPr>
-            <w:r>
-              <w:rPr>
-                <w:sz w:val="20"/>
-              </w:rPr>
-              <w:t>0.180</w:t>
-            </w:r>
-          </w:p>
-        </w:tc>
-        <w:tc>
-          <w:tcPr>
-            <w:tcW w:type="dxa" w:w="1295"/>
-          </w:tcPr>
-          <w:p>
-            <w:pPr>
-              <w:jc w:val="center"/>
-            </w:pPr>
-            <w:r>
-              <w:rPr>
-                <w:sz w:val="20"/>
-              </w:rPr>
-              <w:t>0.620</w:t>
-            </w:r>
-          </w:p>
-        </w:tc>
-        <w:tc>
-          <w:tcPr>
-            <w:tcW w:type="dxa" w:w="1295"/>
-          </w:tcPr>
-          <w:p>
-            <w:pPr>
-              <w:jc w:val="center"/>
-            </w:pPr>
-            <w:r>
-              <w:rPr>
-                <w:sz w:val="20"/>
-              </w:rPr>
-              <w:t>0.944</w:t>
-            </w:r>
-          </w:p>
-        </w:tc>
-        <w:tc>
-          <w:tcPr>
-            <w:tcW w:type="dxa" w:w="1295"/>
-          </w:tcPr>
-          <w:p>
-            <w:pPr>
-              <w:jc w:val="center"/>
-            </w:pPr>
-            <w:r>
-              <w:rPr>
-                <w:sz w:val="20"/>
-              </w:rPr>
-              <w:t>0.172</w:t>
-            </w:r>
-          </w:p>
-        </w:tc>
-        <w:tc>
-          <w:tcPr>
-            <w:tcW w:type="dxa" w:w="1295"/>
-          </w:tcPr>
-          <w:p>
-            <w:pPr>
-              <w:jc w:val="center"/>
-            </w:pPr>
-            <w:r>
-              <w:rPr>
-                <w:sz w:val="20"/>
-              </w:rPr>
-              <w:t>0.227</w:t>
-            </w:r>
-          </w:p>
-        </w:tc>
-        <w:tc>
-          <w:tcPr>
-            <w:tcW w:type="dxa" w:w="1295"/>
-          </w:tcPr>
-          <w:p>
-            <w:pPr>
-              <w:jc w:val="center"/>
-            </w:pPr>
-            <w:r>
-              <w:rPr>
-                <w:sz w:val="20"/>
-              </w:rPr>
-              <w:t>0.996</w:t>
-            </w:r>
-          </w:p>
-        </w:tc>
-      </w:tr>
-      <w:tr>
-        <w:tc>
-          <w:tcPr>
-            <w:tcW w:type="dxa" w:w="1295"/>
-          </w:tcPr>
-          <w:p>
-            <w:pPr>
-              <w:jc w:val="center"/>
-            </w:pPr>
-            <w:r>
-              <w:rPr>
-                <w:sz w:val="20"/>
-              </w:rPr>
-              <w:t>5</w:t>
-            </w:r>
-          </w:p>
-        </w:tc>
-        <w:tc>
-          <w:tcPr>
-            <w:tcW w:type="dxa" w:w="1295"/>
-          </w:tcPr>
-          <w:p>
-            <w:pPr>
-              <w:jc w:val="center"/>
-            </w:pPr>
-            <w:r>
-              <w:rPr>
-                <w:sz w:val="20"/>
-              </w:rPr>
-              <w:t>0.189</w:t>
-            </w:r>
-          </w:p>
-        </w:tc>
-        <w:tc>
-          <w:tcPr>
-            <w:tcW w:type="dxa" w:w="1295"/>
-          </w:tcPr>
-          <w:p>
-            <w:pPr>
-              <w:jc w:val="center"/>
-            </w:pPr>
-            <w:r>
-              <w:rPr>
-                <w:sz w:val="20"/>
-              </w:rPr>
-              <w:t>0.510</w:t>
-            </w:r>
-          </w:p>
-        </w:tc>
-        <w:tc>
-          <w:tcPr>
-            <w:tcW w:type="dxa" w:w="1295"/>
-          </w:tcPr>
-          <w:p>
-            <w:pPr>
-              <w:jc w:val="center"/>
-            </w:pPr>
-            <w:r>
-              <w:rPr>
-                <w:sz w:val="20"/>
-              </w:rPr>
-              <w:t>0.946</w:t>
-            </w:r>
-          </w:p>
-        </w:tc>
-        <w:tc>
-          <w:tcPr>
-            <w:tcW w:type="dxa" w:w="1295"/>
-          </w:tcPr>
-          <w:p>
-            <w:pPr>
-              <w:jc w:val="center"/>
-            </w:pPr>
-            <w:r>
-              <w:rPr>
-                <w:sz w:val="20"/>
-              </w:rPr>
-              <w:t>0.167</w:t>
-            </w:r>
-          </w:p>
-        </w:tc>
-        <w:tc>
-          <w:tcPr>
-            <w:tcW w:type="dxa" w:w="1295"/>
-          </w:tcPr>
-          <w:p>
-            <w:pPr>
-              <w:jc w:val="center"/>
-            </w:pPr>
-            <w:r>
-              <w:rPr>
-                <w:sz w:val="20"/>
-              </w:rPr>
-              <w:t>0.278</w:t>
-            </w:r>
-          </w:p>
-        </w:tc>
-        <w:tc>
-          <w:tcPr>
-            <w:tcW w:type="dxa" w:w="1295"/>
-          </w:tcPr>
-          <w:p>
-            <w:pPr>
-              <w:jc w:val="center"/>
-            </w:pPr>
-            <w:r>
-              <w:rPr>
-                <w:sz w:val="20"/>
-              </w:rPr>
-              <w:t>0.995</w:t>
-            </w:r>
-          </w:p>
-        </w:tc>
-      </w:tr>
-      <w:tr>
-        <w:tc>
-          <w:tcPr>
-            <w:tcW w:type="dxa" w:w="1295"/>
-          </w:tcPr>
-          <w:p>
-            <w:pPr>
-              <w:jc w:val="center"/>
-            </w:pPr>
-            <w:r>
-              <w:rPr>
-                <w:sz w:val="20"/>
-              </w:rPr>
-              <w:t>Mean</w:t>
-            </w:r>
-          </w:p>
-        </w:tc>
-        <w:tc>
-          <w:tcPr>
-            <w:tcW w:type="dxa" w:w="1295"/>
-          </w:tcPr>
-          <w:p>
-            <w:pPr>
-              <w:jc w:val="center"/>
-            </w:pPr>
-            <w:r>
-              <w:rPr>
-                <w:sz w:val="20"/>
-              </w:rPr>
-              <w:t>0.187</w:t>
-            </w:r>
-          </w:p>
-        </w:tc>
-        <w:tc>
-          <w:tcPr>
-            <w:tcW w:type="dxa" w:w="1295"/>
-          </w:tcPr>
-          <w:p>
-            <w:pPr>
-              <w:jc w:val="center"/>
-            </w:pPr>
-            <w:r>
-              <w:rPr>
-                <w:sz w:val="20"/>
-              </w:rPr>
-              <w:t>0.493</w:t>
-            </w:r>
-          </w:p>
-        </w:tc>
-        <w:tc>
-          <w:tcPr>
-            <w:tcW w:type="dxa" w:w="1295"/>
-          </w:tcPr>
-          <w:p>
-            <w:pPr>
-              <w:jc w:val="center"/>
-            </w:pPr>
-            <w:r>
-              <w:rPr>
-                <w:sz w:val="20"/>
-              </w:rPr>
-              <w:t>0.952</w:t>
-            </w:r>
-          </w:p>
-        </w:tc>
-        <w:tc>
-          <w:tcPr>
-            <w:tcW w:type="dxa" w:w="1295"/>
-          </w:tcPr>
-          <w:p>
-            <w:pPr>
-              <w:jc w:val="center"/>
-            </w:pPr>
-            <w:r>
-              <w:rPr>
-                <w:sz w:val="20"/>
-              </w:rPr>
-              <w:t>0.169</w:t>
-            </w:r>
-          </w:p>
-        </w:tc>
-        <w:tc>
-          <w:tcPr>
-            <w:tcW w:type="dxa" w:w="1295"/>
-          </w:tcPr>
-          <w:p>
-            <w:pPr>
-              <w:jc w:val="center"/>
-            </w:pPr>
-            <w:r>
-              <w:rPr>
-                <w:sz w:val="20"/>
-              </w:rPr>
-              <w:t>0.263</w:t>
-            </w:r>
-          </w:p>
-        </w:tc>
-        <w:tc>
-          <w:tcPr>
-            <w:tcW w:type="dxa" w:w="1295"/>
-          </w:tcPr>
-          <w:p>
-            <w:pPr>
-              <w:jc w:val="center"/>
-            </w:pPr>
-            <w:r>
-              <w:rPr>
-                <w:sz w:val="20"/>
-              </w:rPr>
-              <w:t>0.995</w:t>
-            </w:r>
-          </w:p>
-        </w:tc>
-      </w:tr>
-    </w:tbl>
-    <w:p/>
-    <w:p>
-      <w:pPr>
-        <w:spacing w:before="40" w:after="120"/>
-        <w:jc w:val="left"/>
-      </w:pPr>
-      <w:r>
-        <w:rPr>
-          <w:b w:val="0"/>
-          <w:i w:val="0"/>
-          <w:sz w:val="22"/>
-        </w:rPr>
-        <w:t>For var1, fold 4 gave a slightly higher validation MSE (0.62) compared to the others, but overall the results are pretty consistent across folds which suggests the model isn't just getting lucky on a particular data split. For var2 the results are very stable across all folds which is reassuring.</w:t>
+        <w:t>After selecting hyperparameters via CV, I refitted each model on the full 1000 training samples. Train MSE for var1 was 0.1995 (R² = 0.98) and for var2 was 0.1745 (R² = 0.9967). The small train-to-val gap in both cases suggests the models generalise well and are not severely overfitting.</w:t>
       </w:r>
     </w:p>
     <w:p>
@@ -3585,8 +2023,8 @@
       <w:r>
         <w:drawing>
           <wp:inline xmlns:a="http://schemas.openxmlformats.org/drawingml/2006/main" xmlns:pic="http://schemas.openxmlformats.org/drawingml/2006/picture">
-            <wp:extent cx="5303520" cy="1818350"/>
-            <wp:docPr id="4" name="Picture 4"/>
+            <wp:extent cx="5120640" cy="2194150"/>
+            <wp:docPr id="2" name="Picture 2"/>
             <wp:cNvGraphicFramePr>
               <a:graphicFrameLocks noChangeAspect="1"/>
             </wp:cNvGraphicFramePr>
@@ -3594,11 +2032,11 @@
               <a:graphicData uri="http://schemas.openxmlformats.org/drawingml/2006/picture">
                 <pic:pic>
                   <pic:nvPicPr>
-                    <pic:cNvPr id="0" name="fig5_cv_folds.png"/>
+                    <pic:cNvPr id="0" name="fig3_actual_vs_predicted.png"/>
                     <pic:cNvPicPr/>
                   </pic:nvPicPr>
                   <pic:blipFill>
-                    <a:blip r:embed="rId12"/>
+                    <a:blip r:embed="rId10"/>
                     <a:stretch>
                       <a:fillRect/>
                     </a:stretch>
@@ -3606,7 +2044,7 @@
                   <pic:spPr>
                     <a:xfrm>
                       <a:off x="0" y="0"/>
-                      <a:ext cx="5303520" cy="1818350"/>
+                      <a:ext cx="5120640" cy="2194150"/>
                     </a:xfrm>
                     <a:prstGeom prst="rect"/>
                   </pic:spPr>
@@ -3619,7 +2057,7 @@
     </w:p>
     <w:p>
       <w:pPr>
-        <w:spacing w:after="200"/>
+        <w:spacing w:before="20" w:after="120"/>
         <w:jc w:val="center"/>
       </w:pPr>
       <w:r>
@@ -3627,21 +2065,12 @@
           <w:i/>
           <w:sz w:val="18"/>
         </w:rPr>
-        <w:t>Figure 4. Validation MSE for each fold. The dashed line is the mean.</w:t>
+        <w:t>Figure 2. Actual vs predicted y on the full training set. Points close to the diagonal indicate accurate predictions.</w:t>
       </w:r>
     </w:p>
     <w:p>
       <w:pPr>
-        <w:pStyle w:val="Heading2"/>
-        <w:jc w:val="left"/>
-      </w:pPr>
-      <w:r>
-        <w:t>5.3 Fit on the full training data</w:t>
-      </w:r>
-    </w:p>
-    <w:p>
-      <w:pPr>
-        <w:spacing w:before="40" w:after="120"/>
+        <w:spacing w:before="40" w:after="80"/>
         <w:jc w:val="left"/>
       </w:pPr>
       <w:r>
@@ -3650,389 +2079,14 @@
           <w:i w:val="0"/>
           <w:sz w:val="22"/>
         </w:rPr>
-        <w:t>After picking the hyperparameters through cross-validation, I refitted each model on the complete training set of 1000 samples and generated predictions for the test set.</w:t>
-      </w:r>
-    </w:p>
-    <w:p/>
-    <w:tbl>
-      <w:tblPr>
-        <w:tblStyle w:val="TableGrid"/>
-        <w:tblW w:type="auto" w:w="0"/>
-        <w:jc w:val="center"/>
-        <w:tblLook w:firstColumn="1" w:firstRow="1" w:lastColumn="0" w:lastRow="0" w:noHBand="0" w:noVBand="1" w:val="04A0"/>
-      </w:tblPr>
-      <w:tblGrid>
-        <w:gridCol w:w="3022"/>
-        <w:gridCol w:w="3022"/>
-        <w:gridCol w:w="3022"/>
-      </w:tblGrid>
-      <w:tr>
-        <w:tc>
-          <w:tcPr>
-            <w:tcW w:type="dxa" w:w="3022"/>
-          </w:tcPr>
-          <w:p>
-            <w:pPr>
-              <w:jc w:val="center"/>
-            </w:pPr>
-            <w:r>
-              <w:rPr>
-                <w:b/>
-                <w:sz w:val="20"/>
-              </w:rPr>
-              <w:t>Problem</w:t>
-            </w:r>
-          </w:p>
-        </w:tc>
-        <w:tc>
-          <w:tcPr>
-            <w:tcW w:type="dxa" w:w="3022"/>
-          </w:tcPr>
-          <w:p>
-            <w:pPr>
-              <w:jc w:val="center"/>
-            </w:pPr>
-            <w:r>
-              <w:rPr>
-                <w:b/>
-                <w:sz w:val="20"/>
-              </w:rPr>
-              <w:t>Train MSE</w:t>
-            </w:r>
-          </w:p>
-        </w:tc>
-        <w:tc>
-          <w:tcPr>
-            <w:tcW w:type="dxa" w:w="3022"/>
-          </w:tcPr>
-          <w:p>
-            <w:pPr>
-              <w:jc w:val="center"/>
-            </w:pPr>
-            <w:r>
-              <w:rPr>
-                <w:b/>
-                <w:sz w:val="20"/>
-              </w:rPr>
-              <w:t>Train R2</w:t>
-            </w:r>
-          </w:p>
-        </w:tc>
-      </w:tr>
-      <w:tr>
-        <w:tc>
-          <w:tcPr>
-            <w:tcW w:type="dxa" w:w="3022"/>
-          </w:tcPr>
-          <w:p>
-            <w:pPr>
-              <w:jc w:val="center"/>
-            </w:pPr>
-            <w:r>
-              <w:rPr>
-                <w:sz w:val="20"/>
-              </w:rPr>
-              <w:t>Var1 (Steam Turbine)</w:t>
-            </w:r>
-          </w:p>
-        </w:tc>
-        <w:tc>
-          <w:tcPr>
-            <w:tcW w:type="dxa" w:w="3022"/>
-          </w:tcPr>
-          <w:p>
-            <w:pPr>
-              <w:jc w:val="center"/>
-            </w:pPr>
-            <w:r>
-              <w:rPr>
-                <w:sz w:val="20"/>
-              </w:rPr>
-              <w:t>0.1995</w:t>
-            </w:r>
-          </w:p>
-        </w:tc>
-        <w:tc>
-          <w:tcPr>
-            <w:tcW w:type="dxa" w:w="3022"/>
-          </w:tcPr>
-          <w:p>
-            <w:pPr>
-              <w:jc w:val="center"/>
-            </w:pPr>
-            <w:r>
-              <w:rPr>
-                <w:sz w:val="20"/>
-              </w:rPr>
-              <w:t>0.9807</w:t>
-            </w:r>
-          </w:p>
-        </w:tc>
-      </w:tr>
-      <w:tr>
-        <w:tc>
-          <w:tcPr>
-            <w:tcW w:type="dxa" w:w="3022"/>
-          </w:tcPr>
-          <w:p>
-            <w:pPr>
-              <w:jc w:val="center"/>
-            </w:pPr>
-            <w:r>
-              <w:rPr>
-                <w:sz w:val="20"/>
-              </w:rPr>
-              <w:t>Var2 (Thermal Reservoir)</w:t>
-            </w:r>
-          </w:p>
-        </w:tc>
-        <w:tc>
-          <w:tcPr>
-            <w:tcW w:type="dxa" w:w="3022"/>
-          </w:tcPr>
-          <w:p>
-            <w:pPr>
-              <w:jc w:val="center"/>
-            </w:pPr>
-            <w:r>
-              <w:rPr>
-                <w:sz w:val="20"/>
-              </w:rPr>
-              <w:t>0.1745</w:t>
-            </w:r>
-          </w:p>
-        </w:tc>
-        <w:tc>
-          <w:tcPr>
-            <w:tcW w:type="dxa" w:w="3022"/>
-          </w:tcPr>
-          <w:p>
-            <w:pPr>
-              <w:jc w:val="center"/>
-            </w:pPr>
-            <w:r>
-              <w:rPr>
-                <w:sz w:val="20"/>
-              </w:rPr>
-              <w:t>0.9967</w:t>
-            </w:r>
-          </w:p>
-        </w:tc>
-      </w:tr>
-    </w:tbl>
-    <w:p/>
-    <w:p>
-      <w:pPr>
-        <w:jc w:val="center"/>
-      </w:pPr>
-      <w:r>
-        <w:drawing>
-          <wp:inline xmlns:a="http://schemas.openxmlformats.org/drawingml/2006/main" xmlns:pic="http://schemas.openxmlformats.org/drawingml/2006/picture">
-            <wp:extent cx="5303520" cy="2272512"/>
-            <wp:docPr id="5" name="Picture 5"/>
-            <wp:cNvGraphicFramePr>
-              <a:graphicFrameLocks noChangeAspect="1"/>
-            </wp:cNvGraphicFramePr>
-            <a:graphic>
-              <a:graphicData uri="http://schemas.openxmlformats.org/drawingml/2006/picture">
-                <pic:pic>
-                  <pic:nvPicPr>
-                    <pic:cNvPr id="0" name="fig3_actual_vs_predicted.png"/>
-                    <pic:cNvPicPr/>
-                  </pic:nvPicPr>
-                  <pic:blipFill>
-                    <a:blip r:embed="rId13"/>
-                    <a:stretch>
-                      <a:fillRect/>
-                    </a:stretch>
-                  </pic:blipFill>
-                  <pic:spPr>
-                    <a:xfrm>
-                      <a:off x="0" y="0"/>
-                      <a:ext cx="5303520" cy="2272512"/>
-                    </a:xfrm>
-                    <a:prstGeom prst="rect"/>
-                  </pic:spPr>
-                </pic:pic>
-              </a:graphicData>
-            </a:graphic>
-          </wp:inline>
-        </w:drawing>
+        <w:t>The per-fold results below confirm the CV scores are consistent across splits and not driven by one lucky fold:</w:t>
       </w:r>
     </w:p>
     <w:p>
       <w:pPr>
-        <w:spacing w:after="200"/>
-        <w:jc w:val="center"/>
+        <w:spacing w:after="40"/>
       </w:pPr>
-      <w:r>
-        <w:rPr>
-          <w:i/>
-          <w:sz w:val="18"/>
-        </w:rPr>
-        <w:t>Figure 5. Actual vs predicted y on the full training set for both models. Points close to the diagonal line mean accurate predictions.</w:t>
-      </w:r>
     </w:p>
-    <w:p>
-      <w:pPr>
-        <w:jc w:val="center"/>
-      </w:pPr>
-      <w:r>
-        <w:drawing>
-          <wp:inline xmlns:a="http://schemas.openxmlformats.org/drawingml/2006/main" xmlns:pic="http://schemas.openxmlformats.org/drawingml/2006/picture">
-            <wp:extent cx="5303520" cy="2040502"/>
-            <wp:docPr id="6" name="Picture 6"/>
-            <wp:cNvGraphicFramePr>
-              <a:graphicFrameLocks noChangeAspect="1"/>
-            </wp:cNvGraphicFramePr>
-            <a:graphic>
-              <a:graphicData uri="http://schemas.openxmlformats.org/drawingml/2006/picture">
-                <pic:pic>
-                  <pic:nvPicPr>
-                    <pic:cNvPr id="0" name="fig4_residuals.png"/>
-                    <pic:cNvPicPr/>
-                  </pic:nvPicPr>
-                  <pic:blipFill>
-                    <a:blip r:embed="rId14"/>
-                    <a:stretch>
-                      <a:fillRect/>
-                    </a:stretch>
-                  </pic:blipFill>
-                  <pic:spPr>
-                    <a:xfrm>
-                      <a:off x="0" y="0"/>
-                      <a:ext cx="5303520" cy="2040502"/>
-                    </a:xfrm>
-                    <a:prstGeom prst="rect"/>
-                  </pic:spPr>
-                </pic:pic>
-              </a:graphicData>
-            </a:graphic>
-          </wp:inline>
-        </w:drawing>
-      </w:r>
-    </w:p>
-    <w:p>
-      <w:pPr>
-        <w:spacing w:after="200"/>
-        <w:jc w:val="center"/>
-      </w:pPr>
-      <w:r>
-        <w:rPr>
-          <w:i/>
-          <w:sz w:val="18"/>
-        </w:rPr>
-        <w:t>Figure 6. Residuals (actual minus predicted) plotted against predicted values. The spread looks roughly even with no obvious pattern, which is a good sign.</w:t>
-      </w:r>
-    </w:p>
-    <w:p>
-      <w:pPr>
-        <w:spacing w:before="40" w:after="120"/>
-        <w:jc w:val="left"/>
-      </w:pPr>
-      <w:r>
-        <w:rPr>
-          <w:b w:val="0"/>
-          <w:i w:val="0"/>
-          <w:sz w:val="22"/>
-        </w:rPr>
-        <w:t>The train R2 for var1 is 0.98 and the validation R2 was 0.95, so there is a small gap but nothing alarming — it just means the model fits training data a little better than unseen data, which is completely normal. For var2 the gap is even smaller (train R2 = 0.997, val R2 = 0.995), suggesting the model has found the underlying structure very well.</w:t>
-      </w:r>
-    </w:p>
-    <w:p>
-      <w:r>
-        <w:br w:type="page"/>
-      </w:r>
-    </w:p>
-    <w:p>
-      <w:pPr>
-        <w:pStyle w:val="Heading1"/>
-        <w:jc w:val="left"/>
-      </w:pPr>
-      <w:r>
-        <w:t>6. Discussion</w:t>
-      </w:r>
-    </w:p>
-    <w:p>
-      <w:pPr>
-        <w:spacing w:before="40" w:after="120"/>
-        <w:jc w:val="left"/>
-      </w:pPr>
-      <w:r>
-        <w:rPr>
-          <w:b w:val="0"/>
-          <w:i w:val="0"/>
-          <w:sz w:val="22"/>
-        </w:rPr>
-        <w:t>A few things are worth reflecting on from this assignment.</w:t>
-      </w:r>
-    </w:p>
-    <w:p>
-      <w:pPr>
-        <w:spacing w:before="40" w:after="120"/>
-        <w:jc w:val="left"/>
-      </w:pPr>
-      <w:r>
-        <w:rPr>
-          <w:b w:val="0"/>
-          <w:i w:val="0"/>
-          <w:sz w:val="22"/>
-        </w:rPr>
-        <w:t>For var1, I initially expected degree 4 to be the answer based on some quick manual checks I ran at the start. But the full grid search showed that degree 5 with proper regularisation actually does noticeably better. The key was that at low regularisation degree 5 overfits heavily (CV MSE jumps to 1.5), but once you increase alpha to around 2.5, it outperforms degree 4 by about 30% in terms of MSE. This really drove home the importance of tuning both hyperparameters together rather than fixing one and only searching over the other.</w:t>
-      </w:r>
-    </w:p>
-    <w:p>
-      <w:pPr>
-        <w:spacing w:before="40" w:after="120"/>
-        <w:jc w:val="left"/>
-      </w:pPr>
-      <w:r>
-        <w:rPr>
-          <w:b w:val="0"/>
-          <w:i w:val="0"/>
-          <w:sz w:val="22"/>
-        </w:rPr>
-        <w:t>For var2, the high degree (12) was a bit unexpected but makes sense in context. The thermal anomaly score is trying to capture a complex 3D heat map which can have all sorts of peaks and valleys — a high-degree polynomial in three spatial coordinates is actually a reasonable way to model that. And because we only have 3 input features, even degree 12 only gives 454 features, which is well within what Ridge can handle with 1000 training points.</w:t>
-      </w:r>
-    </w:p>
-    <w:p>
-      <w:pPr>
-        <w:spacing w:before="40" w:after="120"/>
-        <w:jc w:val="left"/>
-      </w:pPr>
-      <w:r>
-        <w:rPr>
-          <w:b w:val="0"/>
-          <w:i w:val="0"/>
-          <w:sz w:val="22"/>
-        </w:rPr>
-        <w:t>One thing I would do differently if I had more time is look into whether some of the 461 (var1) or 454 (var2) polynomial features are actually contributing meaningfully to the model, or whether a lot of them are near-zero after regularisation. That could be interesting to explore with something like Lasso or by looking at which monomials have the largest coefficients after the Ridge fit.</w:t>
-      </w:r>
-    </w:p>
-    <w:p>
-      <w:pPr>
-        <w:pStyle w:val="Heading1"/>
-        <w:jc w:val="left"/>
-      </w:pPr>
-      <w:r>
-        <w:t>7. Conclusion</w:t>
-      </w:r>
-    </w:p>
-    <w:p>
-      <w:pPr>
-        <w:spacing w:before="40" w:after="120"/>
-        <w:jc w:val="left"/>
-      </w:pPr>
-      <w:r>
-        <w:rPr>
-          <w:b w:val="0"/>
-          <w:i w:val="0"/>
-          <w:sz w:val="22"/>
-        </w:rPr>
-        <w:t>To summarise, I built two polynomial Ridge regression models for the two assigned problems. The approach was to do a proper grid search over both degree and regularisation strength using 5-fold cross-validation, rather than just picking values by intuition.</w:t>
-      </w:r>
-    </w:p>
-    <w:p/>
     <w:tbl>
       <w:tblPr>
         <w:tblStyle w:val="TableGrid"/>
@@ -4059,7 +2113,635 @@
             <w:r>
               <w:rPr>
                 <w:b/>
-                <w:sz w:val="20"/>
+                <w:sz w:val="19"/>
+              </w:rPr>
+              <w:t>Fold</w:t>
+            </w:r>
+          </w:p>
+        </w:tc>
+        <w:tc>
+          <w:tcPr>
+            <w:tcW w:type="dxa" w:w="1813"/>
+          </w:tcPr>
+          <w:p>
+            <w:pPr>
+              <w:jc w:val="center"/>
+            </w:pPr>
+            <w:r>
+              <w:rPr>
+                <w:b/>
+                <w:sz w:val="19"/>
+              </w:rPr>
+              <w:t>Var1 val MSE</w:t>
+            </w:r>
+          </w:p>
+        </w:tc>
+        <w:tc>
+          <w:tcPr>
+            <w:tcW w:type="dxa" w:w="1813"/>
+          </w:tcPr>
+          <w:p>
+            <w:pPr>
+              <w:jc w:val="center"/>
+            </w:pPr>
+            <w:r>
+              <w:rPr>
+                <w:b/>
+                <w:sz w:val="19"/>
+              </w:rPr>
+              <w:t>Var1 val R²</w:t>
+            </w:r>
+          </w:p>
+        </w:tc>
+        <w:tc>
+          <w:tcPr>
+            <w:tcW w:type="dxa" w:w="1813"/>
+          </w:tcPr>
+          <w:p>
+            <w:pPr>
+              <w:jc w:val="center"/>
+            </w:pPr>
+            <w:r>
+              <w:rPr>
+                <w:b/>
+                <w:sz w:val="19"/>
+              </w:rPr>
+              <w:t>Var2 val MSE</w:t>
+            </w:r>
+          </w:p>
+        </w:tc>
+        <w:tc>
+          <w:tcPr>
+            <w:tcW w:type="dxa" w:w="1813"/>
+          </w:tcPr>
+          <w:p>
+            <w:pPr>
+              <w:jc w:val="center"/>
+            </w:pPr>
+            <w:r>
+              <w:rPr>
+                <w:b/>
+                <w:sz w:val="19"/>
+              </w:rPr>
+              <w:t>Var2 val R²</w:t>
+            </w:r>
+          </w:p>
+        </w:tc>
+      </w:tr>
+      <w:tr>
+        <w:tc>
+          <w:tcPr>
+            <w:tcW w:type="dxa" w:w="1813"/>
+          </w:tcPr>
+          <w:p>
+            <w:pPr>
+              <w:jc w:val="center"/>
+            </w:pPr>
+            <w:r>
+              <w:rPr>
+                <w:sz w:val="19"/>
+              </w:rPr>
+              <w:t>1</w:t>
+            </w:r>
+          </w:p>
+        </w:tc>
+        <w:tc>
+          <w:tcPr>
+            <w:tcW w:type="dxa" w:w="1813"/>
+          </w:tcPr>
+          <w:p>
+            <w:pPr>
+              <w:jc w:val="center"/>
+            </w:pPr>
+            <w:r>
+              <w:rPr>
+                <w:sz w:val="19"/>
+              </w:rPr>
+              <w:t>0.452</w:t>
+            </w:r>
+          </w:p>
+        </w:tc>
+        <w:tc>
+          <w:tcPr>
+            <w:tcW w:type="dxa" w:w="1813"/>
+          </w:tcPr>
+          <w:p>
+            <w:pPr>
+              <w:jc w:val="center"/>
+            </w:pPr>
+            <w:r>
+              <w:rPr>
+                <w:sz w:val="19"/>
+              </w:rPr>
+              <w:t>0.953</w:t>
+            </w:r>
+          </w:p>
+        </w:tc>
+        <w:tc>
+          <w:tcPr>
+            <w:tcW w:type="dxa" w:w="1813"/>
+          </w:tcPr>
+          <w:p>
+            <w:pPr>
+              <w:jc w:val="center"/>
+            </w:pPr>
+            <w:r>
+              <w:rPr>
+                <w:sz w:val="19"/>
+              </w:rPr>
+              <w:t>0.249</w:t>
+            </w:r>
+          </w:p>
+        </w:tc>
+        <w:tc>
+          <w:tcPr>
+            <w:tcW w:type="dxa" w:w="1813"/>
+          </w:tcPr>
+          <w:p>
+            <w:pPr>
+              <w:jc w:val="center"/>
+            </w:pPr>
+            <w:r>
+              <w:rPr>
+                <w:sz w:val="19"/>
+              </w:rPr>
+              <w:t>0.994</w:t>
+            </w:r>
+          </w:p>
+        </w:tc>
+      </w:tr>
+      <w:tr>
+        <w:tc>
+          <w:tcPr>
+            <w:tcW w:type="dxa" w:w="1813"/>
+          </w:tcPr>
+          <w:p>
+            <w:pPr>
+              <w:jc w:val="center"/>
+            </w:pPr>
+            <w:r>
+              <w:rPr>
+                <w:sz w:val="19"/>
+              </w:rPr>
+              <w:t>2</w:t>
+            </w:r>
+          </w:p>
+        </w:tc>
+        <w:tc>
+          <w:tcPr>
+            <w:tcW w:type="dxa" w:w="1813"/>
+          </w:tcPr>
+          <w:p>
+            <w:pPr>
+              <w:jc w:val="center"/>
+            </w:pPr>
+            <w:r>
+              <w:rPr>
+                <w:sz w:val="19"/>
+              </w:rPr>
+              <w:t>0.433</w:t>
+            </w:r>
+          </w:p>
+        </w:tc>
+        <w:tc>
+          <w:tcPr>
+            <w:tcW w:type="dxa" w:w="1813"/>
+          </w:tcPr>
+          <w:p>
+            <w:pPr>
+              <w:jc w:val="center"/>
+            </w:pPr>
+            <w:r>
+              <w:rPr>
+                <w:sz w:val="19"/>
+              </w:rPr>
+              <w:t>0.950</w:t>
+            </w:r>
+          </w:p>
+        </w:tc>
+        <w:tc>
+          <w:tcPr>
+            <w:tcW w:type="dxa" w:w="1813"/>
+          </w:tcPr>
+          <w:p>
+            <w:pPr>
+              <w:jc w:val="center"/>
+            </w:pPr>
+            <w:r>
+              <w:rPr>
+                <w:sz w:val="19"/>
+              </w:rPr>
+              <w:t>0.291</w:t>
+            </w:r>
+          </w:p>
+        </w:tc>
+        <w:tc>
+          <w:tcPr>
+            <w:tcW w:type="dxa" w:w="1813"/>
+          </w:tcPr>
+          <w:p>
+            <w:pPr>
+              <w:jc w:val="center"/>
+            </w:pPr>
+            <w:r>
+              <w:rPr>
+                <w:sz w:val="19"/>
+              </w:rPr>
+              <w:t>0.995</w:t>
+            </w:r>
+          </w:p>
+        </w:tc>
+      </w:tr>
+      <w:tr>
+        <w:tc>
+          <w:tcPr>
+            <w:tcW w:type="dxa" w:w="1813"/>
+          </w:tcPr>
+          <w:p>
+            <w:pPr>
+              <w:jc w:val="center"/>
+            </w:pPr>
+            <w:r>
+              <w:rPr>
+                <w:sz w:val="19"/>
+              </w:rPr>
+              <w:t>3</w:t>
+            </w:r>
+          </w:p>
+        </w:tc>
+        <w:tc>
+          <w:tcPr>
+            <w:tcW w:type="dxa" w:w="1813"/>
+          </w:tcPr>
+          <w:p>
+            <w:pPr>
+              <w:jc w:val="center"/>
+            </w:pPr>
+            <w:r>
+              <w:rPr>
+                <w:sz w:val="19"/>
+              </w:rPr>
+              <w:t>0.447</w:t>
+            </w:r>
+          </w:p>
+        </w:tc>
+        <w:tc>
+          <w:tcPr>
+            <w:tcW w:type="dxa" w:w="1813"/>
+          </w:tcPr>
+          <w:p>
+            <w:pPr>
+              <w:jc w:val="center"/>
+            </w:pPr>
+            <w:r>
+              <w:rPr>
+                <w:sz w:val="19"/>
+              </w:rPr>
+              <w:t>0.965</w:t>
+            </w:r>
+          </w:p>
+        </w:tc>
+        <w:tc>
+          <w:tcPr>
+            <w:tcW w:type="dxa" w:w="1813"/>
+          </w:tcPr>
+          <w:p>
+            <w:pPr>
+              <w:jc w:val="center"/>
+            </w:pPr>
+            <w:r>
+              <w:rPr>
+                <w:sz w:val="19"/>
+              </w:rPr>
+              <w:t>0.269</w:t>
+            </w:r>
+          </w:p>
+        </w:tc>
+        <w:tc>
+          <w:tcPr>
+            <w:tcW w:type="dxa" w:w="1813"/>
+          </w:tcPr>
+          <w:p>
+            <w:pPr>
+              <w:jc w:val="center"/>
+            </w:pPr>
+            <w:r>
+              <w:rPr>
+                <w:sz w:val="19"/>
+              </w:rPr>
+              <w:t>0.996</w:t>
+            </w:r>
+          </w:p>
+        </w:tc>
+      </w:tr>
+      <w:tr>
+        <w:tc>
+          <w:tcPr>
+            <w:tcW w:type="dxa" w:w="1813"/>
+          </w:tcPr>
+          <w:p>
+            <w:pPr>
+              <w:jc w:val="center"/>
+            </w:pPr>
+            <w:r>
+              <w:rPr>
+                <w:sz w:val="19"/>
+              </w:rPr>
+              <w:t>4</w:t>
+            </w:r>
+          </w:p>
+        </w:tc>
+        <w:tc>
+          <w:tcPr>
+            <w:tcW w:type="dxa" w:w="1813"/>
+          </w:tcPr>
+          <w:p>
+            <w:pPr>
+              <w:jc w:val="center"/>
+            </w:pPr>
+            <w:r>
+              <w:rPr>
+                <w:sz w:val="19"/>
+              </w:rPr>
+              <w:t>0.620</w:t>
+            </w:r>
+          </w:p>
+        </w:tc>
+        <w:tc>
+          <w:tcPr>
+            <w:tcW w:type="dxa" w:w="1813"/>
+          </w:tcPr>
+          <w:p>
+            <w:pPr>
+              <w:jc w:val="center"/>
+            </w:pPr>
+            <w:r>
+              <w:rPr>
+                <w:sz w:val="19"/>
+              </w:rPr>
+              <w:t>0.944</w:t>
+            </w:r>
+          </w:p>
+        </w:tc>
+        <w:tc>
+          <w:tcPr>
+            <w:tcW w:type="dxa" w:w="1813"/>
+          </w:tcPr>
+          <w:p>
+            <w:pPr>
+              <w:jc w:val="center"/>
+            </w:pPr>
+            <w:r>
+              <w:rPr>
+                <w:sz w:val="19"/>
+              </w:rPr>
+              <w:t>0.227</w:t>
+            </w:r>
+          </w:p>
+        </w:tc>
+        <w:tc>
+          <w:tcPr>
+            <w:tcW w:type="dxa" w:w="1813"/>
+          </w:tcPr>
+          <w:p>
+            <w:pPr>
+              <w:jc w:val="center"/>
+            </w:pPr>
+            <w:r>
+              <w:rPr>
+                <w:sz w:val="19"/>
+              </w:rPr>
+              <w:t>0.996</w:t>
+            </w:r>
+          </w:p>
+        </w:tc>
+      </w:tr>
+      <w:tr>
+        <w:tc>
+          <w:tcPr>
+            <w:tcW w:type="dxa" w:w="1813"/>
+          </w:tcPr>
+          <w:p>
+            <w:pPr>
+              <w:jc w:val="center"/>
+            </w:pPr>
+            <w:r>
+              <w:rPr>
+                <w:sz w:val="19"/>
+              </w:rPr>
+              <w:t>5</w:t>
+            </w:r>
+          </w:p>
+        </w:tc>
+        <w:tc>
+          <w:tcPr>
+            <w:tcW w:type="dxa" w:w="1813"/>
+          </w:tcPr>
+          <w:p>
+            <w:pPr>
+              <w:jc w:val="center"/>
+            </w:pPr>
+            <w:r>
+              <w:rPr>
+                <w:sz w:val="19"/>
+              </w:rPr>
+              <w:t>0.510</w:t>
+            </w:r>
+          </w:p>
+        </w:tc>
+        <w:tc>
+          <w:tcPr>
+            <w:tcW w:type="dxa" w:w="1813"/>
+          </w:tcPr>
+          <w:p>
+            <w:pPr>
+              <w:jc w:val="center"/>
+            </w:pPr>
+            <w:r>
+              <w:rPr>
+                <w:sz w:val="19"/>
+              </w:rPr>
+              <w:t>0.946</w:t>
+            </w:r>
+          </w:p>
+        </w:tc>
+        <w:tc>
+          <w:tcPr>
+            <w:tcW w:type="dxa" w:w="1813"/>
+          </w:tcPr>
+          <w:p>
+            <w:pPr>
+              <w:jc w:val="center"/>
+            </w:pPr>
+            <w:r>
+              <w:rPr>
+                <w:sz w:val="19"/>
+              </w:rPr>
+              <w:t>0.278</w:t>
+            </w:r>
+          </w:p>
+        </w:tc>
+        <w:tc>
+          <w:tcPr>
+            <w:tcW w:type="dxa" w:w="1813"/>
+          </w:tcPr>
+          <w:p>
+            <w:pPr>
+              <w:jc w:val="center"/>
+            </w:pPr>
+            <w:r>
+              <w:rPr>
+                <w:sz w:val="19"/>
+              </w:rPr>
+              <w:t>0.995</w:t>
+            </w:r>
+          </w:p>
+        </w:tc>
+      </w:tr>
+      <w:tr>
+        <w:tc>
+          <w:tcPr>
+            <w:tcW w:type="dxa" w:w="1813"/>
+          </w:tcPr>
+          <w:p>
+            <w:pPr>
+              <w:jc w:val="center"/>
+            </w:pPr>
+            <w:r>
+              <w:rPr>
+                <w:sz w:val="19"/>
+              </w:rPr>
+              <w:t>Mean</w:t>
+            </w:r>
+          </w:p>
+        </w:tc>
+        <w:tc>
+          <w:tcPr>
+            <w:tcW w:type="dxa" w:w="1813"/>
+          </w:tcPr>
+          <w:p>
+            <w:pPr>
+              <w:jc w:val="center"/>
+            </w:pPr>
+            <w:r>
+              <w:rPr>
+                <w:sz w:val="19"/>
+              </w:rPr>
+              <w:t>0.493</w:t>
+            </w:r>
+          </w:p>
+        </w:tc>
+        <w:tc>
+          <w:tcPr>
+            <w:tcW w:type="dxa" w:w="1813"/>
+          </w:tcPr>
+          <w:p>
+            <w:pPr>
+              <w:jc w:val="center"/>
+            </w:pPr>
+            <w:r>
+              <w:rPr>
+                <w:sz w:val="19"/>
+              </w:rPr>
+              <w:t>0.952</w:t>
+            </w:r>
+          </w:p>
+        </w:tc>
+        <w:tc>
+          <w:tcPr>
+            <w:tcW w:type="dxa" w:w="1813"/>
+          </w:tcPr>
+          <w:p>
+            <w:pPr>
+              <w:jc w:val="center"/>
+            </w:pPr>
+            <w:r>
+              <w:rPr>
+                <w:sz w:val="19"/>
+              </w:rPr>
+              <w:t>0.263</w:t>
+            </w:r>
+          </w:p>
+        </w:tc>
+        <w:tc>
+          <w:tcPr>
+            <w:tcW w:type="dxa" w:w="1813"/>
+          </w:tcPr>
+          <w:p>
+            <w:pPr>
+              <w:jc w:val="center"/>
+            </w:pPr>
+            <w:r>
+              <w:rPr>
+                <w:sz w:val="19"/>
+              </w:rPr>
+              <w:t>0.995</w:t>
+            </w:r>
+          </w:p>
+        </w:tc>
+      </w:tr>
+    </w:tbl>
+    <w:p>
+      <w:pPr>
+        <w:spacing w:after="80"/>
+      </w:pPr>
+    </w:p>
+    <w:p>
+      <w:pPr>
+        <w:pStyle w:val="Heading1"/>
+        <w:spacing w:before="80" w:after="60"/>
+        <w:jc w:val="left"/>
+      </w:pPr>
+      <w:r>
+        <w:t>5. Conclusion</w:t>
+      </w:r>
+    </w:p>
+    <w:p>
+      <w:pPr>
+        <w:spacing w:before="40" w:after="80"/>
+        <w:jc w:val="left"/>
+      </w:pPr>
+      <w:r>
+        <w:rPr>
+          <w:b w:val="0"/>
+          <w:i w:val="0"/>
+          <w:sz w:val="22"/>
+        </w:rPr>
+        <w:t>I built two polynomial Ridge regression models using an exhaustive coarse-to-fine grid search with 5-fold cross-validation to jointly tune degree and regularisation strength. The final configurations are:</w:t>
+      </w:r>
+    </w:p>
+    <w:p>
+      <w:pPr>
+        <w:spacing w:after="40"/>
+      </w:pPr>
+    </w:p>
+    <w:tbl>
+      <w:tblPr>
+        <w:tblStyle w:val="TableGrid"/>
+        <w:tblW w:type="auto" w:w="0"/>
+        <w:jc w:val="center"/>
+        <w:tblLook w:firstColumn="1" w:firstRow="1" w:lastColumn="0" w:lastRow="0" w:noHBand="0" w:noVBand="1" w:val="04A0"/>
+      </w:tblPr>
+      <w:tblGrid>
+        <w:gridCol w:w="1813"/>
+        <w:gridCol w:w="1813"/>
+        <w:gridCol w:w="1813"/>
+        <w:gridCol w:w="1813"/>
+        <w:gridCol w:w="1813"/>
+      </w:tblGrid>
+      <w:tr>
+        <w:tc>
+          <w:tcPr>
+            <w:tcW w:type="dxa" w:w="1813"/>
+          </w:tcPr>
+          <w:p>
+            <w:pPr>
+              <w:jc w:val="center"/>
+            </w:pPr>
+            <w:r>
+              <w:rPr>
+                <w:b/>
+                <w:sz w:val="19"/>
               </w:rPr>
               <w:t>Problem</w:t>
             </w:r>
@@ -4076,7 +2758,7 @@
             <w:r>
               <w:rPr>
                 <w:b/>
-                <w:sz w:val="20"/>
+                <w:sz w:val="19"/>
               </w:rPr>
               <w:t>Degree</w:t>
             </w:r>
@@ -4093,7 +2775,7 @@
             <w:r>
               <w:rPr>
                 <w:b/>
-                <w:sz w:val="20"/>
+                <w:sz w:val="19"/>
               </w:rPr>
               <w:t>Alpha</w:t>
             </w:r>
@@ -4110,7 +2792,7 @@
             <w:r>
               <w:rPr>
                 <w:b/>
-                <w:sz w:val="20"/>
+                <w:sz w:val="19"/>
               </w:rPr>
               <w:t>CV MSE</w:t>
             </w:r>
@@ -4127,9 +2809,9 @@
             <w:r>
               <w:rPr>
                 <w:b/>
-                <w:sz w:val="20"/>
+                <w:sz w:val="19"/>
               </w:rPr>
-              <w:t>CV R2</w:t>
+              <w:t>CV R²</w:t>
             </w:r>
           </w:p>
         </w:tc>
@@ -4145,7 +2827,7 @@
             </w:pPr>
             <w:r>
               <w:rPr>
-                <w:sz w:val="20"/>
+                <w:sz w:val="19"/>
               </w:rPr>
               <w:t>Var1 – Net Power Score</w:t>
             </w:r>
@@ -4161,7 +2843,7 @@
             </w:pPr>
             <w:r>
               <w:rPr>
-                <w:sz w:val="20"/>
+                <w:sz w:val="19"/>
               </w:rPr>
               <w:t>5</w:t>
             </w:r>
@@ -4177,7 +2859,7 @@
             </w:pPr>
             <w:r>
               <w:rPr>
-                <w:sz w:val="20"/>
+                <w:sz w:val="19"/>
               </w:rPr>
               <w:t>2.477</w:t>
             </w:r>
@@ -4193,7 +2875,7 @@
             </w:pPr>
             <w:r>
               <w:rPr>
-                <w:sz w:val="20"/>
+                <w:sz w:val="19"/>
               </w:rPr>
               <w:t>0.493</w:t>
             </w:r>
@@ -4209,7 +2891,7 @@
             </w:pPr>
             <w:r>
               <w:rPr>
-                <w:sz w:val="20"/>
+                <w:sz w:val="19"/>
               </w:rPr>
               <w:t>0.952</w:t>
             </w:r>
@@ -4227,7 +2909,7 @@
             </w:pPr>
             <w:r>
               <w:rPr>
-                <w:sz w:val="20"/>
+                <w:sz w:val="19"/>
               </w:rPr>
               <w:t>Var2 – Thermal Anomaly</w:t>
             </w:r>
@@ -4243,7 +2925,7 @@
             </w:pPr>
             <w:r>
               <w:rPr>
-                <w:sz w:val="20"/>
+                <w:sz w:val="19"/>
               </w:rPr>
               <w:t>12</w:t>
             </w:r>
@@ -4259,7 +2941,7 @@
             </w:pPr>
             <w:r>
               <w:rPr>
-                <w:sz w:val="20"/>
+                <w:sz w:val="19"/>
               </w:rPr>
               <w:t>0.231</w:t>
             </w:r>
@@ -4275,7 +2957,7 @@
             </w:pPr>
             <w:r>
               <w:rPr>
-                <w:sz w:val="20"/>
+                <w:sz w:val="19"/>
               </w:rPr>
               <w:t>0.263</w:t>
             </w:r>
@@ -4291,7 +2973,7 @@
             </w:pPr>
             <w:r>
               <w:rPr>
-                <w:sz w:val="20"/>
+                <w:sz w:val="19"/>
               </w:rPr>
               <w:t>0.995</w:t>
             </w:r>
@@ -4299,10 +2981,14 @@
         </w:tc>
       </w:tr>
     </w:tbl>
-    <w:p/>
     <w:p>
       <w:pPr>
-        <w:spacing w:before="40" w:after="120"/>
+        <w:spacing w:after="80"/>
+      </w:pPr>
+    </w:p>
+    <w:p>
+      <w:pPr>
+        <w:spacing w:before="40" w:after="80"/>
         <w:jc w:val="left"/>
       </w:pPr>
       <w:r>
@@ -4311,12 +2997,12 @@
           <w:i w:val="0"/>
           <w:sz w:val="22"/>
         </w:rPr>
-        <w:t>Both models ended up with strong cross-validation scores, particularly var2 which hit an R2 of 0.995. The residual plots look well-behaved and the train-val gap is small for both, so I'm fairly confident the models will generalise well to the hidden test data.</w:t>
+        <w:t>Both models achieved strong cross-validation scores. Var2 in particular reached near-perfect R² of 0.995, suggesting the degree-12 polynomial captures the underlying thermal structure very well. The main takeaway from var1 was that degree and alpha have to be tuned together — degree 5 looked worse than degree 4 at low regularisation but clearly beat it once a strong enough penalty was applied.</w:t>
       </w:r>
     </w:p>
     <w:p>
       <w:pPr>
-        <w:spacing w:before="120" w:after="120"/>
+        <w:spacing w:before="80" w:after="80"/>
         <w:jc w:val="left"/>
       </w:pPr>
       <w:r>
@@ -4325,12 +3011,12 @@
           <w:i/>
           <w:sz w:val="22"/>
         </w:rPr>
-        <w:t>Prediction files (BT2024078_pred_var1.csv and BT2024078_pred_var2.csv) are submitted alongside this report.</w:t>
+        <w:t>Prediction files BT2024078_pred_var1.csv and BT2024078_pred_var2.csv are submitted alongside this report.</w:t>
       </w:r>
     </w:p>
     <w:sectPr>
       <w:pgSz w:w="12240" w:h="15840"/>
-      <w:pgMar w:top="1247" w:right="1587" w:bottom="1247" w:left="1587" w:header="720" w:footer="720" w:gutter="0"/>
+      <w:pgMar w:top="1247" w:right="1587" w:bottom="1134" w:left="1587" w:header="720" w:footer="720" w:gutter="0"/>
       <w:cols w:space="720"/>
       <w:docGrid w:linePitch="360"/>
     </w:sectPr>

</xml_diff>